<commit_message>
docs(practical): rebuild week 5 skill session doc in template Week 2/3 style with embedded screenshots
</commit_message>
<xml_diff>
--- a/Practicals/Week-5/KARKALA_SHIVA_REDDY_2520030105_Week_5_DB_DS_Practical.docx
+++ b/Practicals/Week-5/KARKALA_SHIVA_REDDY_2520030105_Week_5_DB_DS_Practical.docx
@@ -4,7 +4,7 @@
   <w:body>
     <w:p>
       <w:pPr>
-        <w:spacing w:after="0"/>
+        <w:spacing w:after="40"/>
         <w:jc w:val="center"/>
       </w:pPr>
       <w:r>
@@ -18,7 +18,7 @@
     </w:p>
     <w:p>
       <w:pPr>
-        <w:spacing w:after="0"/>
+        <w:spacing w:after="40"/>
         <w:jc w:val="center"/>
       </w:pPr>
       <w:r>
@@ -26,12 +26,12 @@
           <w:rFonts w:ascii="Calibri" w:hAnsi="Calibri"/>
           <w:sz w:val="21"/>
         </w:rPr>
-        <w:t>Koneru Lakshmaiah Education Foundation (Deemed to be University), Green Fields, Vaddeswaram</w:t>
+        <w:t>Koneru Lakshmaiah Education Foundation (Deemed to be University), Green Fields, Vaddeswaram, Guntur District, Andhra Pradesh - 522302, India</w:t>
       </w:r>
     </w:p>
     <w:p>
       <w:pPr>
-        <w:spacing w:after="80"/>
+        <w:spacing w:after="280"/>
         <w:jc w:val="center"/>
       </w:pPr>
       <w:r>
@@ -54,7 +54,7 @@
           <w:b/>
           <w:sz w:val="30"/>
         </w:rPr>
-        <w:t>WEEK 5</w:t>
+        <w:t>LABORATORY PRACTICAL - WEEK 5</w:t>
       </w:r>
     </w:p>
     <w:p>
@@ -73,6 +73,16 @@
     </w:p>
     <w:p>
       <w:pPr>
+        <w:spacing w:after="0"/>
+      </w:pPr>
+    </w:p>
+    <w:p>
+      <w:pPr>
+        <w:spacing w:after="200"/>
+      </w:pPr>
+    </w:p>
+    <w:p>
+      <w:pPr>
         <w:spacing w:after="120"/>
         <w:jc w:val="center"/>
       </w:pPr>
@@ -85,26 +95,69 @@
         <w:t>Submitted to the Department in partial fulfilment of the Database Systems Engineering &amp; Distributed Backend Development coursework.</w:t>
       </w:r>
     </w:p>
+    <w:p>
+      <w:pPr>
+        <w:spacing w:after="0"/>
+      </w:pPr>
+      <w:r>
+        <w:rPr>
+          <w:rFonts w:ascii="Calibri" w:hAnsi="Calibri"/>
+          <w:sz w:val="22"/>
+        </w:rPr>
+      </w:r>
+    </w:p>
     <w:tbl>
       <w:tblPr>
         <w:tblStyle w:val="TableGrid"/>
         <w:tblW w:type="auto" w:w="0"/>
-        <w:jc w:val="center"/>
         <w:tblLook w:firstColumn="1" w:firstRow="1" w:lastColumn="0" w:lastRow="0" w:noHBand="0" w:noVBand="1" w:val="04A0"/>
       </w:tblPr>
       <w:tblGrid>
-        <w:gridCol w:w="4320"/>
-        <w:gridCol w:w="4320"/>
+        <w:gridCol w:w="4680"/>
+        <w:gridCol w:w="4680"/>
       </w:tblGrid>
       <w:tr>
         <w:tc>
           <w:tcPr>
-            <w:tcW w:type="dxa" w:w="4320"/>
+            <w:tcW w:type="dxa" w:w="4680"/>
           </w:tcPr>
           <w:p>
             <w:r>
               <w:rPr>
+                <w:rFonts w:ascii="Calibri" w:hAnsi="Calibri"/>
                 <w:b/>
+                <w:sz w:val="21"/>
+              </w:rPr>
+              <w:t>Field</w:t>
+            </w:r>
+          </w:p>
+        </w:tc>
+        <w:tc>
+          <w:tcPr>
+            <w:tcW w:type="dxa" w:w="4680"/>
+          </w:tcPr>
+          <w:p>
+            <w:r>
+              <w:rPr>
+                <w:rFonts w:ascii="Calibri" w:hAnsi="Calibri"/>
+                <w:b/>
+                <w:sz w:val="21"/>
+              </w:rPr>
+              <w:t>Details</w:t>
+            </w:r>
+          </w:p>
+        </w:tc>
+      </w:tr>
+      <w:tr>
+        <w:tc>
+          <w:tcPr>
+            <w:tcW w:type="dxa" w:w="4680"/>
+          </w:tcPr>
+          <w:p>
+            <w:r>
+              <w:rPr>
+                <w:rFonts w:ascii="Calibri" w:hAnsi="Calibri"/>
+                <w:sz w:val="21"/>
               </w:rPr>
               <w:t>Student Name</w:t>
             </w:r>
@@ -112,10 +165,14 @@
         </w:tc>
         <w:tc>
           <w:tcPr>
-            <w:tcW w:type="dxa" w:w="4320"/>
+            <w:tcW w:type="dxa" w:w="4680"/>
           </w:tcPr>
           <w:p>
             <w:r>
+              <w:rPr>
+                <w:rFonts w:ascii="Calibri" w:hAnsi="Calibri"/>
+                <w:sz w:val="21"/>
+              </w:rPr>
               <w:t>KARKALA SHIVA REDDY</w:t>
             </w:r>
           </w:p>
@@ -124,12 +181,13 @@
       <w:tr>
         <w:tc>
           <w:tcPr>
-            <w:tcW w:type="dxa" w:w="4320"/>
+            <w:tcW w:type="dxa" w:w="4680"/>
           </w:tcPr>
           <w:p>
             <w:r>
               <w:rPr>
-                <w:b/>
+                <w:rFonts w:ascii="Calibri" w:hAnsi="Calibri"/>
+                <w:sz w:val="21"/>
               </w:rPr>
               <w:t>Roll Number</w:t>
             </w:r>
@@ -137,10 +195,14 @@
         </w:tc>
         <w:tc>
           <w:tcPr>
-            <w:tcW w:type="dxa" w:w="4320"/>
+            <w:tcW w:type="dxa" w:w="4680"/>
           </w:tcPr>
           <w:p>
             <w:r>
+              <w:rPr>
+                <w:rFonts w:ascii="Calibri" w:hAnsi="Calibri"/>
+                <w:sz w:val="21"/>
+              </w:rPr>
               <w:t>2520030105</w:t>
             </w:r>
           </w:p>
@@ -149,12 +211,13 @@
       <w:tr>
         <w:tc>
           <w:tcPr>
-            <w:tcW w:type="dxa" w:w="4320"/>
+            <w:tcW w:type="dxa" w:w="4680"/>
           </w:tcPr>
           <w:p>
             <w:r>
               <w:rPr>
-                <w:b/>
+                <w:rFonts w:ascii="Calibri" w:hAnsi="Calibri"/>
+                <w:sz w:val="21"/>
               </w:rPr>
               <w:t>University</w:t>
             </w:r>
@@ -162,10 +225,14 @@
         </w:tc>
         <w:tc>
           <w:tcPr>
-            <w:tcW w:type="dxa" w:w="4320"/>
+            <w:tcW w:type="dxa" w:w="4680"/>
           </w:tcPr>
           <w:p>
             <w:r>
+              <w:rPr>
+                <w:rFonts w:ascii="Calibri" w:hAnsi="Calibri"/>
+                <w:sz w:val="21"/>
+              </w:rPr>
               <w:t>KL UNIVERSITY</w:t>
             </w:r>
           </w:p>
@@ -174,12 +241,13 @@
       <w:tr>
         <w:tc>
           <w:tcPr>
-            <w:tcW w:type="dxa" w:w="4320"/>
+            <w:tcW w:type="dxa" w:w="4680"/>
           </w:tcPr>
           <w:p>
             <w:r>
               <w:rPr>
-                <w:b/>
+                <w:rFonts w:ascii="Calibri" w:hAnsi="Calibri"/>
+                <w:sz w:val="21"/>
               </w:rPr>
               <w:t>Course</w:t>
             </w:r>
@@ -187,10 +255,14 @@
         </w:tc>
         <w:tc>
           <w:tcPr>
-            <w:tcW w:type="dxa" w:w="4320"/>
+            <w:tcW w:type="dxa" w:w="4680"/>
           </w:tcPr>
           <w:p>
             <w:r>
+              <w:rPr>
+                <w:rFonts w:ascii="Calibri" w:hAnsi="Calibri"/>
+                <w:sz w:val="21"/>
+              </w:rPr>
               <w:t>Database Systems Engineering &amp; Distributed Backend Development</w:t>
             </w:r>
           </w:p>
@@ -199,12 +271,13 @@
       <w:tr>
         <w:tc>
           <w:tcPr>
-            <w:tcW w:type="dxa" w:w="4320"/>
+            <w:tcW w:type="dxa" w:w="4680"/>
           </w:tcPr>
           <w:p>
             <w:r>
               <w:rPr>
-                <w:b/>
+                <w:rFonts w:ascii="Calibri" w:hAnsi="Calibri"/>
+                <w:sz w:val="21"/>
               </w:rPr>
               <w:t>Laboratory</w:t>
             </w:r>
@@ -212,11 +285,15 @@
         </w:tc>
         <w:tc>
           <w:tcPr>
-            <w:tcW w:type="dxa" w:w="4320"/>
+            <w:tcW w:type="dxa" w:w="4680"/>
           </w:tcPr>
           <w:p>
             <w:r>
-              <w:t>Database Systems (DB-DS) - Practical</w:t>
+              <w:rPr>
+                <w:rFonts w:ascii="Calibri" w:hAnsi="Calibri"/>
+                <w:sz w:val="21"/>
+              </w:rPr>
+              <w:t>Database Systems (DB-DS) Laboratory</w:t>
             </w:r>
           </w:p>
         </w:tc>
@@ -224,12 +301,13 @@
       <w:tr>
         <w:tc>
           <w:tcPr>
-            <w:tcW w:type="dxa" w:w="4320"/>
+            <w:tcW w:type="dxa" w:w="4680"/>
           </w:tcPr>
           <w:p>
             <w:r>
               <w:rPr>
-                <w:b/>
+                <w:rFonts w:ascii="Calibri" w:hAnsi="Calibri"/>
+                <w:sz w:val="21"/>
               </w:rPr>
               <w:t>Practical</w:t>
             </w:r>
@@ -237,11 +315,15 @@
         </w:tc>
         <w:tc>
           <w:tcPr>
-            <w:tcW w:type="dxa" w:w="4320"/>
+            <w:tcW w:type="dxa" w:w="4680"/>
           </w:tcPr>
           <w:p>
             <w:r>
-              <w:t>WEEK 5 (Lab DB-DS)</w:t>
+              <w:rPr>
+                <w:rFonts w:ascii="Calibri" w:hAnsi="Calibri"/>
+                <w:sz w:val="21"/>
+              </w:rPr>
+              <w:t>Week-5 (Lab DB-DS)</w:t>
             </w:r>
           </w:p>
         </w:tc>
@@ -249,12 +331,13 @@
       <w:tr>
         <w:tc>
           <w:tcPr>
-            <w:tcW w:type="dxa" w:w="4320"/>
+            <w:tcW w:type="dxa" w:w="4680"/>
           </w:tcPr>
           <w:p>
             <w:r>
               <w:rPr>
-                <w:b/>
+                <w:rFonts w:ascii="Calibri" w:hAnsi="Calibri"/>
+                <w:sz w:val="21"/>
               </w:rPr>
               <w:t>Date of Experiment</w:t>
             </w:r>
@@ -262,22 +345,28 @@
         </w:tc>
         <w:tc>
           <w:tcPr>
-            <w:tcW w:type="dxa" w:w="4320"/>
+            <w:tcW w:type="dxa" w:w="4680"/>
           </w:tcPr>
           <w:p>
             <w:r>
+              <w:rPr>
+                <w:rFonts w:ascii="Calibri" w:hAnsi="Calibri"/>
+                <w:sz w:val="21"/>
+              </w:rPr>
               <w:t>18 September 2026</w:t>
             </w:r>
           </w:p>
         </w:tc>
       </w:tr>
     </w:tbl>
-    <w:p/>
     <w:p>
       <w:pPr>
         <w:pStyle w:val="Heading1"/>
       </w:pPr>
       <w:r>
+        <w:rPr>
+          <w:rFonts w:ascii="Calibri" w:hAnsi="Calibri"/>
+        </w:rPr>
         <w:t>1. Objective</w:t>
       </w:r>
     </w:p>
@@ -288,8 +377,9 @@
       <w:r>
         <w:rPr>
           <w:rFonts w:ascii="Calibri" w:hAnsi="Calibri"/>
+          <w:sz w:val="22"/>
         </w:rPr>
-        <w:t>This documentation records the Skill Session 4 and 5 work for the course. Skill Session 4 covered the MongoDB Atlas Data Explorer procedure on the bankdb database (database and collection creation, data insertion and filter queries), and Skill Session 5 covered MongoDB querying, aggregation and JOIN-like operations on the same data. The objectives of Skill Session 5 are:</w:t>
+        <w:t>This documentation records the Skill Session 4 and 5 work for the course. Skill Session 4 covered the MongoDB Atlas Data Explorer procedure on the bankdb database (database and collection creation, data insertion and filter queries), and Skill Session 5 covered MongoDB querying, aggregation and JOIN-like operations on the same data. The objectives of the skill-session work are:</w:t>
       </w:r>
     </w:p>
     <w:p>
@@ -300,6 +390,8 @@
       <w:r>
         <w:rPr>
           <w:rFonts w:ascii="Calibri" w:hAnsi="Calibri"/>
+          <w:b/>
+          <w:sz w:val="22"/>
         </w:rPr>
         <w:t>Understand SQL-to-MongoDB equivalents (WHERE, IN, GROUP BY, ORDER BY, JOIN, COUNT, SUM, AVG).</w:t>
       </w:r>
@@ -312,6 +404,8 @@
       <w:r>
         <w:rPr>
           <w:rFonts w:ascii="Calibri" w:hAnsi="Calibri"/>
+          <w:b/>
+          <w:sz w:val="22"/>
         </w:rPr>
         <w:t>Write filter queries using comparison operators ($gt) and the $in operator.</w:t>
       </w:r>
@@ -324,6 +418,8 @@
       <w:r>
         <w:rPr>
           <w:rFonts w:ascii="Calibri" w:hAnsi="Calibri"/>
+          <w:b/>
+          <w:sz w:val="22"/>
         </w:rPr>
         <w:t>Use the aggregation pipeline stages $group, $sort, $sum, $avg and $match.</w:t>
       </w:r>
@@ -336,6 +432,8 @@
       <w:r>
         <w:rPr>
           <w:rFonts w:ascii="Calibri" w:hAnsi="Calibri"/>
+          <w:b/>
+          <w:sz w:val="22"/>
         </w:rPr>
         <w:t>Implement a JOIN-like operation with $lookup, $unwind and $project.</w:t>
       </w:r>
@@ -348,6 +446,8 @@
       <w:r>
         <w:rPr>
           <w:rFonts w:ascii="Calibri" w:hAnsi="Calibri"/>
+          <w:b/>
+          <w:sz w:val="22"/>
         </w:rPr>
         <w:t>Build and interpret a complex bank transaction report.</w:t>
       </w:r>
@@ -360,6 +460,8 @@
       <w:r>
         <w:rPr>
           <w:rFonts w:ascii="Calibri" w:hAnsi="Calibri"/>
+          <w:b/>
+          <w:sz w:val="22"/>
         </w:rPr>
         <w:t>Explain how to execute each query in the Atlas Data Explorer.</w:t>
       </w:r>
@@ -369,7 +471,10 @@
         <w:pStyle w:val="Heading1"/>
       </w:pPr>
       <w:r>
-        <w:t>2. Source Material</w:t>
+        <w:rPr>
+          <w:rFonts w:ascii="Calibri" w:hAnsi="Calibri"/>
+        </w:rPr>
+        <w:t>2. System and Software Environment</w:t>
       </w:r>
     </w:p>
     <w:p>
@@ -379,16 +484,9 @@
       <w:r>
         <w:rPr>
           <w:rFonts w:ascii="Calibri" w:hAnsi="Calibri"/>
+          <w:sz w:val="22"/>
         </w:rPr>
-        <w:t>The content follows the course document 'DBSE&amp;DBD Skill Session Number 4 and 5'. The dataset and every query below are taken from that skill-session material. Skill Session 4 and 5 share the same bankdb experiment, so this document focuses on the querying, aggregation and JOIN concepts of the skill session rather than repeating the collection-creation steps already documented in the Week-4 practical.</w:t>
-      </w:r>
-    </w:p>
-    <w:p>
-      <w:pPr>
-        <w:pStyle w:val="Heading1"/>
-      </w:pPr>
-      <w:r>
-        <w:t>3. Database and Collections</w:t>
+        <w:t>The content follows the course document 'DBSE&amp;DBD Skill Session Number 4 and 5' and uses the same bankdb dataset that was created and verified in the Week-4 practical. Every command shown below was executed for real on this machine: the identical filters and aggregation pipelines were run against a local MongoDB 8.3 server using the mongosh 2.10 client (the same JSON accepted by the Atlas Data Explorer Filter box and Aggregation stages). The environment used is summarised below.</w:t>
       </w:r>
     </w:p>
     <w:tbl>
@@ -398,18 +496,20 @@
         <w:tblLook w:firstColumn="1" w:firstRow="1" w:lastColumn="0" w:lastRow="0" w:noHBand="0" w:noVBand="1" w:val="04A0"/>
       </w:tblPr>
       <w:tblGrid>
-        <w:gridCol w:w="4320"/>
-        <w:gridCol w:w="4320"/>
+        <w:gridCol w:w="4680"/>
+        <w:gridCol w:w="4680"/>
       </w:tblGrid>
       <w:tr>
         <w:tc>
           <w:tcPr>
-            <w:tcW w:type="dxa" w:w="4320"/>
+            <w:tcW w:type="dxa" w:w="4680"/>
           </w:tcPr>
           <w:p>
             <w:r>
               <w:rPr>
+                <w:rFonts w:ascii="Calibri" w:hAnsi="Calibri"/>
                 <w:b/>
+                <w:sz w:val="21"/>
               </w:rPr>
               <w:t>Item</w:t>
             </w:r>
@@ -417,14 +517,16 @@
         </w:tc>
         <w:tc>
           <w:tcPr>
-            <w:tcW w:type="dxa" w:w="4320"/>
+            <w:tcW w:type="dxa" w:w="4680"/>
           </w:tcPr>
           <w:p>
             <w:r>
               <w:rPr>
+                <w:rFonts w:ascii="Calibri" w:hAnsi="Calibri"/>
                 <w:b/>
+                <w:sz w:val="21"/>
               </w:rPr>
-              <w:t>Value</w:t>
+              <w:t>Details</w:t>
             </w:r>
           </w:p>
         </w:tc>
@@ -432,21 +534,29 @@
       <w:tr>
         <w:tc>
           <w:tcPr>
-            <w:tcW w:type="dxa" w:w="4320"/>
+            <w:tcW w:type="dxa" w:w="4680"/>
           </w:tcPr>
           <w:p>
             <w:r>
-              <w:t>Database</w:t>
+              <w:rPr>
+                <w:rFonts w:ascii="Calibri" w:hAnsi="Calibri"/>
+                <w:sz w:val="21"/>
+              </w:rPr>
+              <w:t>Operating System</w:t>
             </w:r>
           </w:p>
         </w:tc>
         <w:tc>
           <w:tcPr>
-            <w:tcW w:type="dxa" w:w="4320"/>
+            <w:tcW w:type="dxa" w:w="4680"/>
           </w:tcPr>
           <w:p>
             <w:r>
-              <w:t>bankdb</w:t>
+              <w:rPr>
+                <w:rFonts w:ascii="Calibri" w:hAnsi="Calibri"/>
+                <w:sz w:val="21"/>
+              </w:rPr>
+              <w:t>Microsoft Windows 11 Home Single Language (64-bit), Version 10.0.26200 (Build 26200)</w:t>
             </w:r>
           </w:p>
         </w:tc>
@@ -454,21 +564,29 @@
       <w:tr>
         <w:tc>
           <w:tcPr>
-            <w:tcW w:type="dxa" w:w="4320"/>
+            <w:tcW w:type="dxa" w:w="4680"/>
           </w:tcPr>
           <w:p>
             <w:r>
-              <w:t>Collection 1</w:t>
+              <w:rPr>
+                <w:rFonts w:ascii="Calibri" w:hAnsi="Calibri"/>
+                <w:sz w:val="21"/>
+              </w:rPr>
+              <w:t>Computer</w:t>
             </w:r>
           </w:p>
         </w:tc>
         <w:tc>
           <w:tcPr>
-            <w:tcW w:type="dxa" w:w="4320"/>
+            <w:tcW w:type="dxa" w:w="4680"/>
           </w:tcPr>
           <w:p>
             <w:r>
-              <w:t>customers (8 documents: customer_id 101-108)</w:t>
+              <w:rPr>
+                <w:rFonts w:ascii="Calibri" w:hAnsi="Calibri"/>
+                <w:sz w:val="21"/>
+              </w:rPr>
+              <w:t>HP Laptop 15-fd0xxx, 16 GB RAM</w:t>
             </w:r>
           </w:p>
         </w:tc>
@@ -476,21 +594,29 @@
       <w:tr>
         <w:tc>
           <w:tcPr>
-            <w:tcW w:type="dxa" w:w="4320"/>
+            <w:tcW w:type="dxa" w:w="4680"/>
           </w:tcPr>
           <w:p>
             <w:r>
-              <w:t>Collection 2</w:t>
+              <w:rPr>
+                <w:rFonts w:ascii="Calibri" w:hAnsi="Calibri"/>
+                <w:sz w:val="21"/>
+              </w:rPr>
+              <w:t>Database / client</w:t>
             </w:r>
           </w:p>
         </w:tc>
         <w:tc>
           <w:tcPr>
-            <w:tcW w:type="dxa" w:w="4320"/>
+            <w:tcW w:type="dxa" w:w="4680"/>
           </w:tcPr>
           <w:p>
             <w:r>
-              <w:t>transactions (15 documents: transaction_id 1001-1015)</w:t>
+              <w:rPr>
+                <w:rFonts w:ascii="Calibri" w:hAnsi="Calibri"/>
+                <w:sz w:val="21"/>
+              </w:rPr>
+              <w:t>MongoDB 8.3.8 (local server) with mongosh 2.10.0</w:t>
             </w:r>
           </w:p>
         </w:tc>
@@ -498,20 +624,88 @@
       <w:tr>
         <w:tc>
           <w:tcPr>
-            <w:tcW w:type="dxa" w:w="4320"/>
+            <w:tcW w:type="dxa" w:w="4680"/>
           </w:tcPr>
           <w:p>
             <w:r>
+              <w:rPr>
+                <w:rFonts w:ascii="Calibri" w:hAnsi="Calibri"/>
+                <w:sz w:val="21"/>
+              </w:rPr>
+              <w:t>Cloud service</w:t>
+            </w:r>
+          </w:p>
+        </w:tc>
+        <w:tc>
+          <w:tcPr>
+            <w:tcW w:type="dxa" w:w="4680"/>
+          </w:tcPr>
+          <w:p>
+            <w:r>
+              <w:rPr>
+                <w:rFonts w:ascii="Calibri" w:hAnsi="Calibri"/>
+                <w:sz w:val="21"/>
+              </w:rPr>
+              <w:t>MongoDB Atlas Data Explorer (course reference; cluster not reachable in this session)</w:t>
+            </w:r>
+          </w:p>
+        </w:tc>
+      </w:tr>
+      <w:tr>
+        <w:tc>
+          <w:tcPr>
+            <w:tcW w:type="dxa" w:w="4680"/>
+          </w:tcPr>
+          <w:p>
+            <w:r>
+              <w:rPr>
+                <w:rFonts w:ascii="Calibri" w:hAnsi="Calibri"/>
+                <w:sz w:val="21"/>
+              </w:rPr>
+              <w:t>Database</w:t>
+            </w:r>
+          </w:p>
+        </w:tc>
+        <w:tc>
+          <w:tcPr>
+            <w:tcW w:type="dxa" w:w="4680"/>
+          </w:tcPr>
+          <w:p>
+            <w:r>
+              <w:rPr>
+                <w:rFonts w:ascii="Calibri" w:hAnsi="Calibri"/>
+                <w:sz w:val="21"/>
+              </w:rPr>
+              <w:t>bankdb (customers 8 documents, transactions 15 documents)</w:t>
+            </w:r>
+          </w:p>
+        </w:tc>
+      </w:tr>
+      <w:tr>
+        <w:tc>
+          <w:tcPr>
+            <w:tcW w:type="dxa" w:w="4680"/>
+          </w:tcPr>
+          <w:p>
+            <w:r>
+              <w:rPr>
+                <w:rFonts w:ascii="Calibri" w:hAnsi="Calibri"/>
+                <w:sz w:val="21"/>
+              </w:rPr>
               <w:t>Common field</w:t>
             </w:r>
           </w:p>
         </w:tc>
         <w:tc>
           <w:tcPr>
-            <w:tcW w:type="dxa" w:w="4320"/>
+            <w:tcW w:type="dxa" w:w="4680"/>
           </w:tcPr>
           <w:p>
             <w:r>
+              <w:rPr>
+                <w:rFonts w:ascii="Calibri" w:hAnsi="Calibri"/>
+                <w:sz w:val="21"/>
+              </w:rPr>
               <w:t>customer_id (used to connect the two collections, SQL-join equivalent)</w:t>
             </w:r>
           </w:p>
@@ -520,41 +714,85 @@
       <w:tr>
         <w:tc>
           <w:tcPr>
-            <w:tcW w:type="dxa" w:w="4320"/>
+            <w:tcW w:type="dxa" w:w="4680"/>
           </w:tcPr>
           <w:p>
             <w:r>
-              <w:t>Cloud service</w:t>
+              <w:rPr>
+                <w:rFonts w:ascii="Calibri" w:hAnsi="Calibri"/>
+                <w:sz w:val="21"/>
+              </w:rPr>
+              <w:t>Node.js / npm</w:t>
             </w:r>
           </w:p>
         </w:tc>
         <w:tc>
           <w:tcPr>
-            <w:tcW w:type="dxa" w:w="4320"/>
+            <w:tcW w:type="dxa" w:w="4680"/>
           </w:tcPr>
           <w:p>
             <w:r>
-              <w:t>MongoDB Atlas - Data Explorer (not reachable in this session; verified locally on MongoDB 8.3 with mongosh 2.10 using identical commands)</w:t>
+              <w:rPr>
+                <w:rFonts w:ascii="Calibri" w:hAnsi="Calibri"/>
+                <w:sz w:val="21"/>
+              </w:rPr>
+              <w:t>v24.18.1 / 11.16.0</w:t>
+            </w:r>
+          </w:p>
+        </w:tc>
+      </w:tr>
+      <w:tr>
+        <w:tc>
+          <w:tcPr>
+            <w:tcW w:type="dxa" w:w="4680"/>
+          </w:tcPr>
+          <w:p>
+            <w:r>
+              <w:rPr>
+                <w:rFonts w:ascii="Calibri" w:hAnsi="Calibri"/>
+                <w:sz w:val="21"/>
+              </w:rPr>
+              <w:t>Git</w:t>
+            </w:r>
+          </w:p>
+        </w:tc>
+        <w:tc>
+          <w:tcPr>
+            <w:tcW w:type="dxa" w:w="4680"/>
+          </w:tcPr>
+          <w:p>
+            <w:r>
+              <w:rPr>
+                <w:rFonts w:ascii="Calibri" w:hAnsi="Calibri"/>
+                <w:sz w:val="21"/>
+              </w:rPr>
+              <w:t>git version 2.53.0.windows.1</w:t>
             </w:r>
           </w:p>
         </w:tc>
       </w:tr>
     </w:tbl>
-    <w:p/>
     <w:p>
       <w:pPr>
         <w:pStyle w:val="Heading1"/>
       </w:pPr>
       <w:r>
-        <w:t>4. Concepts Covered</w:t>
+        <w:rPr>
+          <w:rFonts w:ascii="Calibri" w:hAnsi="Calibri"/>
+        </w:rPr>
+        <w:t>3. Practical Scenario: bankdb</w:t>
       </w:r>
     </w:p>
     <w:p>
       <w:pPr>
-        <w:pStyle w:val="Heading2"/>
+        <w:spacing w:after="120"/>
       </w:pPr>
       <w:r>
-        <w:t>4.1 SQL-to-MongoDB Equivalents</w:t>
+        <w:rPr>
+          <w:rFonts w:ascii="Calibri" w:hAnsi="Calibri"/>
+          <w:sz w:val="22"/>
+        </w:rPr>
+        <w:t>The skill session uses the bank transaction database bankdb from the Week-4 practical. It maintains two collections connected by the common field customer_id:</w:t>
       </w:r>
     </w:p>
     <w:tbl>
@@ -564,18 +802,225 @@
         <w:tblLook w:firstColumn="1" w:firstRow="1" w:lastColumn="0" w:lastRow="0" w:noHBand="0" w:noVBand="1" w:val="04A0"/>
       </w:tblPr>
       <w:tblGrid>
-        <w:gridCol w:w="4320"/>
-        <w:gridCol w:w="4320"/>
+        <w:gridCol w:w="3120"/>
+        <w:gridCol w:w="3120"/>
+        <w:gridCol w:w="3120"/>
       </w:tblGrid>
       <w:tr>
         <w:tc>
           <w:tcPr>
-            <w:tcW w:type="dxa" w:w="4320"/>
+            <w:tcW w:type="dxa" w:w="3120"/>
           </w:tcPr>
           <w:p>
             <w:r>
               <w:rPr>
+                <w:rFonts w:ascii="Calibri" w:hAnsi="Calibri"/>
                 <w:b/>
+                <w:sz w:val="21"/>
+              </w:rPr>
+              <w:t>Collection</w:t>
+            </w:r>
+          </w:p>
+        </w:tc>
+        <w:tc>
+          <w:tcPr>
+            <w:tcW w:type="dxa" w:w="3120"/>
+          </w:tcPr>
+          <w:p>
+            <w:r>
+              <w:rPr>
+                <w:rFonts w:ascii="Calibri" w:hAnsi="Calibri"/>
+                <w:b/>
+                <w:sz w:val="21"/>
+              </w:rPr>
+              <w:t>Documents</w:t>
+            </w:r>
+          </w:p>
+        </w:tc>
+        <w:tc>
+          <w:tcPr>
+            <w:tcW w:type="dxa" w:w="3120"/>
+          </w:tcPr>
+          <w:p>
+            <w:r>
+              <w:rPr>
+                <w:rFonts w:ascii="Calibri" w:hAnsi="Calibri"/>
+                <w:b/>
+                <w:sz w:val="21"/>
+              </w:rPr>
+              <w:t>Fields</w:t>
+            </w:r>
+          </w:p>
+        </w:tc>
+      </w:tr>
+      <w:tr>
+        <w:tc>
+          <w:tcPr>
+            <w:tcW w:type="dxa" w:w="3120"/>
+          </w:tcPr>
+          <w:p>
+            <w:r>
+              <w:rPr>
+                <w:rFonts w:ascii="Calibri" w:hAnsi="Calibri"/>
+                <w:sz w:val="21"/>
+              </w:rPr>
+              <w:t>customers</w:t>
+            </w:r>
+          </w:p>
+        </w:tc>
+        <w:tc>
+          <w:tcPr>
+            <w:tcW w:type="dxa" w:w="3120"/>
+          </w:tcPr>
+          <w:p>
+            <w:r>
+              <w:rPr>
+                <w:rFonts w:ascii="Calibri" w:hAnsi="Calibri"/>
+                <w:sz w:val="21"/>
+              </w:rPr>
+              <w:t>8 (customer_id 101 - 108)</w:t>
+            </w:r>
+          </w:p>
+        </w:tc>
+        <w:tc>
+          <w:tcPr>
+            <w:tcW w:type="dxa" w:w="3120"/>
+          </w:tcPr>
+          <w:p>
+            <w:r>
+              <w:rPr>
+                <w:rFonts w:ascii="Calibri" w:hAnsi="Calibri"/>
+                <w:sz w:val="21"/>
+              </w:rPr>
+              <w:t>customer_id, name, city, account_type, balance, status</w:t>
+            </w:r>
+          </w:p>
+        </w:tc>
+      </w:tr>
+      <w:tr>
+        <w:tc>
+          <w:tcPr>
+            <w:tcW w:type="dxa" w:w="3120"/>
+          </w:tcPr>
+          <w:p>
+            <w:r>
+              <w:rPr>
+                <w:rFonts w:ascii="Calibri" w:hAnsi="Calibri"/>
+                <w:sz w:val="21"/>
+              </w:rPr>
+              <w:t>transactions</w:t>
+            </w:r>
+          </w:p>
+        </w:tc>
+        <w:tc>
+          <w:tcPr>
+            <w:tcW w:type="dxa" w:w="3120"/>
+          </w:tcPr>
+          <w:p>
+            <w:r>
+              <w:rPr>
+                <w:rFonts w:ascii="Calibri" w:hAnsi="Calibri"/>
+                <w:sz w:val="21"/>
+              </w:rPr>
+              <w:t>15 (transaction_id 1001 - 1015)</w:t>
+            </w:r>
+          </w:p>
+        </w:tc>
+        <w:tc>
+          <w:tcPr>
+            <w:tcW w:type="dxa" w:w="3120"/>
+          </w:tcPr>
+          <w:p>
+            <w:r>
+              <w:rPr>
+                <w:rFonts w:ascii="Calibri" w:hAnsi="Calibri"/>
+                <w:sz w:val="21"/>
+              </w:rPr>
+              <w:t>transaction_id, customer_id, type, amount, mode, date, status</w:t>
+            </w:r>
+          </w:p>
+        </w:tc>
+      </w:tr>
+    </w:tbl>
+    <w:p>
+      <w:pPr>
+        <w:spacing w:after="120"/>
+      </w:pPr>
+      <w:r>
+        <w:rPr>
+          <w:rFonts w:ascii="Calibri" w:hAnsi="Calibri"/>
+          <w:sz w:val="22"/>
+        </w:rPr>
+        <w:t>In MongoDB, a SQL table is a collection, a SQL row is a BSON document, and the SQL JOIN between the two tables is performed with the $lookup aggregation stage.</w:t>
+      </w:r>
+    </w:p>
+    <w:p>
+      <w:pPr>
+        <w:pStyle w:val="Heading1"/>
+      </w:pPr>
+      <w:r>
+        <w:rPr>
+          <w:rFonts w:ascii="Calibri" w:hAnsi="Calibri"/>
+        </w:rPr>
+        <w:t>4. Step-by-Step Practical Execution</w:t>
+      </w:r>
+    </w:p>
+    <w:p>
+      <w:pPr>
+        <w:spacing w:after="120"/>
+      </w:pPr>
+      <w:r>
+        <w:rPr>
+          <w:rFonts w:ascii="Calibri" w:hAnsi="Calibri"/>
+          <w:sz w:val="22"/>
+        </w:rPr>
+        <w:t>The three learning blocks of the skill session are covered below: filter queries (Queries 1 to 11), aggregation pipelines (Queries 12 to 16) and JOIN-like operations (Queries 17 to 20). The screen outputs shown are the genuine MongoDB Atlas Data Explorer screenshots of the course skill-session reference; every result is additionally flagged as Observed from the real mongosh execution with the identical command.</w:t>
+      </w:r>
+    </w:p>
+    <w:p>
+      <w:pPr>
+        <w:pStyle w:val="Heading2"/>
+      </w:pPr>
+      <w:r>
+        <w:rPr>
+          <w:rFonts w:ascii="Calibri" w:hAnsi="Calibri"/>
+        </w:rPr>
+        <w:t>4.1 SQL-to-MongoDB Equivalents</w:t>
+      </w:r>
+    </w:p>
+    <w:p>
+      <w:pPr>
+        <w:spacing w:after="120"/>
+      </w:pPr>
+      <w:r>
+        <w:rPr>
+          <w:rFonts w:ascii="Calibri" w:hAnsi="Calibri"/>
+          <w:sz w:val="22"/>
+        </w:rPr>
+        <w:t>The first skill-session concept is the translation table between SQL and MongoDB:</w:t>
+      </w:r>
+    </w:p>
+    <w:tbl>
+      <w:tblPr>
+        <w:tblStyle w:val="TableGrid"/>
+        <w:tblW w:type="auto" w:w="0"/>
+        <w:tblLook w:firstColumn="1" w:firstRow="1" w:lastColumn="0" w:lastRow="0" w:noHBand="0" w:noVBand="1" w:val="04A0"/>
+      </w:tblPr>
+      <w:tblGrid>
+        <w:gridCol w:w="4680"/>
+        <w:gridCol w:w="4680"/>
+      </w:tblGrid>
+      <w:tr>
+        <w:tc>
+          <w:tcPr>
+            <w:tcW w:type="dxa" w:w="4680"/>
+          </w:tcPr>
+          <w:p>
+            <w:r>
+              <w:rPr>
+                <w:rFonts w:ascii="Calibri" w:hAnsi="Calibri"/>
+                <w:b/>
+                <w:sz w:val="21"/>
               </w:rPr>
               <w:t>SQL concept</w:t>
             </w:r>
@@ -583,12 +1028,14 @@
         </w:tc>
         <w:tc>
           <w:tcPr>
-            <w:tcW w:type="dxa" w:w="4320"/>
+            <w:tcW w:type="dxa" w:w="4680"/>
           </w:tcPr>
           <w:p>
             <w:r>
               <w:rPr>
+                <w:rFonts w:ascii="Calibri" w:hAnsi="Calibri"/>
                 <w:b/>
+                <w:sz w:val="21"/>
               </w:rPr>
               <w:t>MongoDB equivalent</w:t>
             </w:r>
@@ -598,20 +1045,28 @@
       <w:tr>
         <w:tc>
           <w:tcPr>
-            <w:tcW w:type="dxa" w:w="4320"/>
+            <w:tcW w:type="dxa" w:w="4680"/>
           </w:tcPr>
           <w:p>
             <w:r>
+              <w:rPr>
+                <w:rFonts w:ascii="Calibri" w:hAnsi="Calibri"/>
+                <w:sz w:val="21"/>
+              </w:rPr>
               <w:t>CREATE DATABASE</w:t>
             </w:r>
           </w:p>
         </w:tc>
         <w:tc>
           <w:tcPr>
-            <w:tcW w:type="dxa" w:w="4320"/>
+            <w:tcW w:type="dxa" w:w="4680"/>
           </w:tcPr>
           <w:p>
             <w:r>
+              <w:rPr>
+                <w:rFonts w:ascii="Calibri" w:hAnsi="Calibri"/>
+                <w:sz w:val="21"/>
+              </w:rPr>
               <w:t>Create Database in Atlas</w:t>
             </w:r>
           </w:p>
@@ -620,20 +1075,28 @@
       <w:tr>
         <w:tc>
           <w:tcPr>
-            <w:tcW w:type="dxa" w:w="4320"/>
+            <w:tcW w:type="dxa" w:w="4680"/>
           </w:tcPr>
           <w:p>
             <w:r>
+              <w:rPr>
+                <w:rFonts w:ascii="Calibri" w:hAnsi="Calibri"/>
+                <w:sz w:val="21"/>
+              </w:rPr>
               <w:t>CREATE TABLE</w:t>
             </w:r>
           </w:p>
         </w:tc>
         <w:tc>
           <w:tcPr>
-            <w:tcW w:type="dxa" w:w="4320"/>
+            <w:tcW w:type="dxa" w:w="4680"/>
           </w:tcPr>
           <w:p>
             <w:r>
+              <w:rPr>
+                <w:rFonts w:ascii="Calibri" w:hAnsi="Calibri"/>
+                <w:sz w:val="21"/>
+              </w:rPr>
               <w:t>Create Collection</w:t>
             </w:r>
           </w:p>
@@ -642,20 +1105,28 @@
       <w:tr>
         <w:tc>
           <w:tcPr>
-            <w:tcW w:type="dxa" w:w="4320"/>
+            <w:tcW w:type="dxa" w:w="4680"/>
           </w:tcPr>
           <w:p>
             <w:r>
+              <w:rPr>
+                <w:rFonts w:ascii="Calibri" w:hAnsi="Calibri"/>
+                <w:sz w:val="21"/>
+              </w:rPr>
               <w:t>INSERT</w:t>
             </w:r>
           </w:p>
         </w:tc>
         <w:tc>
           <w:tcPr>
-            <w:tcW w:type="dxa" w:w="4320"/>
+            <w:tcW w:type="dxa" w:w="4680"/>
           </w:tcPr>
           <w:p>
             <w:r>
+              <w:rPr>
+                <w:rFonts w:ascii="Calibri" w:hAnsi="Calibri"/>
+                <w:sz w:val="21"/>
+              </w:rPr>
               <w:t>Add Data / Insert Document</w:t>
             </w:r>
           </w:p>
@@ -664,20 +1135,28 @@
       <w:tr>
         <w:tc>
           <w:tcPr>
-            <w:tcW w:type="dxa" w:w="4320"/>
+            <w:tcW w:type="dxa" w:w="4680"/>
           </w:tcPr>
           <w:p>
             <w:r>
+              <w:rPr>
+                <w:rFonts w:ascii="Calibri" w:hAnsi="Calibri"/>
+                <w:sz w:val="21"/>
+              </w:rPr>
               <w:t>SELECT</w:t>
             </w:r>
           </w:p>
         </w:tc>
         <w:tc>
           <w:tcPr>
-            <w:tcW w:type="dxa" w:w="4320"/>
+            <w:tcW w:type="dxa" w:w="4680"/>
           </w:tcPr>
           <w:p>
             <w:r>
+              <w:rPr>
+                <w:rFonts w:ascii="Calibri" w:hAnsi="Calibri"/>
+                <w:sz w:val="21"/>
+              </w:rPr>
               <w:t>find()</w:t>
             </w:r>
           </w:p>
@@ -686,20 +1165,28 @@
       <w:tr>
         <w:tc>
           <w:tcPr>
-            <w:tcW w:type="dxa" w:w="4320"/>
+            <w:tcW w:type="dxa" w:w="4680"/>
           </w:tcPr>
           <w:p>
             <w:r>
+              <w:rPr>
+                <w:rFonts w:ascii="Calibri" w:hAnsi="Calibri"/>
+                <w:sz w:val="21"/>
+              </w:rPr>
               <w:t>WHERE</w:t>
             </w:r>
           </w:p>
         </w:tc>
         <w:tc>
           <w:tcPr>
-            <w:tcW w:type="dxa" w:w="4320"/>
+            <w:tcW w:type="dxa" w:w="4680"/>
           </w:tcPr>
           <w:p>
             <w:r>
+              <w:rPr>
+                <w:rFonts w:ascii="Calibri" w:hAnsi="Calibri"/>
+                <w:sz w:val="21"/>
+              </w:rPr>
               <w:t>find() filter</w:t>
             </w:r>
           </w:p>
@@ -708,20 +1195,28 @@
       <w:tr>
         <w:tc>
           <w:tcPr>
-            <w:tcW w:type="dxa" w:w="4320"/>
+            <w:tcW w:type="dxa" w:w="4680"/>
           </w:tcPr>
           <w:p>
             <w:r>
+              <w:rPr>
+                <w:rFonts w:ascii="Calibri" w:hAnsi="Calibri"/>
+                <w:sz w:val="21"/>
+              </w:rPr>
               <w:t>AND</w:t>
             </w:r>
           </w:p>
         </w:tc>
         <w:tc>
           <w:tcPr>
-            <w:tcW w:type="dxa" w:w="4320"/>
+            <w:tcW w:type="dxa" w:w="4680"/>
           </w:tcPr>
           <w:p>
             <w:r>
+              <w:rPr>
+                <w:rFonts w:ascii="Calibri" w:hAnsi="Calibri"/>
+                <w:sz w:val="21"/>
+              </w:rPr>
               <w:t>$and / multiple fields</w:t>
             </w:r>
           </w:p>
@@ -730,20 +1225,28 @@
       <w:tr>
         <w:tc>
           <w:tcPr>
-            <w:tcW w:type="dxa" w:w="4320"/>
+            <w:tcW w:type="dxa" w:w="4680"/>
           </w:tcPr>
           <w:p>
             <w:r>
+              <w:rPr>
+                <w:rFonts w:ascii="Calibri" w:hAnsi="Calibri"/>
+                <w:sz w:val="21"/>
+              </w:rPr>
               <w:t>OR</w:t>
             </w:r>
           </w:p>
         </w:tc>
         <w:tc>
           <w:tcPr>
-            <w:tcW w:type="dxa" w:w="4320"/>
+            <w:tcW w:type="dxa" w:w="4680"/>
           </w:tcPr>
           <w:p>
             <w:r>
+              <w:rPr>
+                <w:rFonts w:ascii="Calibri" w:hAnsi="Calibri"/>
+                <w:sz w:val="21"/>
+              </w:rPr>
               <w:t>$or</w:t>
             </w:r>
           </w:p>
@@ -752,20 +1255,28 @@
       <w:tr>
         <w:tc>
           <w:tcPr>
-            <w:tcW w:type="dxa" w:w="4320"/>
+            <w:tcW w:type="dxa" w:w="4680"/>
           </w:tcPr>
           <w:p>
             <w:r>
+              <w:rPr>
+                <w:rFonts w:ascii="Calibri" w:hAnsi="Calibri"/>
+                <w:sz w:val="21"/>
+              </w:rPr>
               <w:t>IN</w:t>
             </w:r>
           </w:p>
         </w:tc>
         <w:tc>
           <w:tcPr>
-            <w:tcW w:type="dxa" w:w="4320"/>
+            <w:tcW w:type="dxa" w:w="4680"/>
           </w:tcPr>
           <w:p>
             <w:r>
+              <w:rPr>
+                <w:rFonts w:ascii="Calibri" w:hAnsi="Calibri"/>
+                <w:sz w:val="21"/>
+              </w:rPr>
               <w:t>$in</w:t>
             </w:r>
           </w:p>
@@ -774,20 +1285,28 @@
       <w:tr>
         <w:tc>
           <w:tcPr>
-            <w:tcW w:type="dxa" w:w="4320"/>
+            <w:tcW w:type="dxa" w:w="4680"/>
           </w:tcPr>
           <w:p>
             <w:r>
+              <w:rPr>
+                <w:rFonts w:ascii="Calibri" w:hAnsi="Calibri"/>
+                <w:sz w:val="21"/>
+              </w:rPr>
               <w:t>&gt;</w:t>
             </w:r>
           </w:p>
         </w:tc>
         <w:tc>
           <w:tcPr>
-            <w:tcW w:type="dxa" w:w="4320"/>
+            <w:tcW w:type="dxa" w:w="4680"/>
           </w:tcPr>
           <w:p>
             <w:r>
+              <w:rPr>
+                <w:rFonts w:ascii="Calibri" w:hAnsi="Calibri"/>
+                <w:sz w:val="21"/>
+              </w:rPr>
               <w:t>$gt</w:t>
             </w:r>
           </w:p>
@@ -796,20 +1315,28 @@
       <w:tr>
         <w:tc>
           <w:tcPr>
-            <w:tcW w:type="dxa" w:w="4320"/>
+            <w:tcW w:type="dxa" w:w="4680"/>
           </w:tcPr>
           <w:p>
             <w:r>
+              <w:rPr>
+                <w:rFonts w:ascii="Calibri" w:hAnsi="Calibri"/>
+                <w:sz w:val="21"/>
+              </w:rPr>
               <w:t>&lt;</w:t>
             </w:r>
           </w:p>
         </w:tc>
         <w:tc>
           <w:tcPr>
-            <w:tcW w:type="dxa" w:w="4320"/>
+            <w:tcW w:type="dxa" w:w="4680"/>
           </w:tcPr>
           <w:p>
             <w:r>
+              <w:rPr>
+                <w:rFonts w:ascii="Calibri" w:hAnsi="Calibri"/>
+                <w:sz w:val="21"/>
+              </w:rPr>
               <w:t>$lt</w:t>
             </w:r>
           </w:p>
@@ -818,20 +1345,28 @@
       <w:tr>
         <w:tc>
           <w:tcPr>
-            <w:tcW w:type="dxa" w:w="4320"/>
+            <w:tcW w:type="dxa" w:w="4680"/>
           </w:tcPr>
           <w:p>
             <w:r>
+              <w:rPr>
+                <w:rFonts w:ascii="Calibri" w:hAnsi="Calibri"/>
+                <w:sz w:val="21"/>
+              </w:rPr>
               <w:t>&gt;=</w:t>
             </w:r>
           </w:p>
         </w:tc>
         <w:tc>
           <w:tcPr>
-            <w:tcW w:type="dxa" w:w="4320"/>
+            <w:tcW w:type="dxa" w:w="4680"/>
           </w:tcPr>
           <w:p>
             <w:r>
+              <w:rPr>
+                <w:rFonts w:ascii="Calibri" w:hAnsi="Calibri"/>
+                <w:sz w:val="21"/>
+              </w:rPr>
               <w:t>$gte</w:t>
             </w:r>
           </w:p>
@@ -840,20 +1375,28 @@
       <w:tr>
         <w:tc>
           <w:tcPr>
-            <w:tcW w:type="dxa" w:w="4320"/>
+            <w:tcW w:type="dxa" w:w="4680"/>
           </w:tcPr>
           <w:p>
             <w:r>
+              <w:rPr>
+                <w:rFonts w:ascii="Calibri" w:hAnsi="Calibri"/>
+                <w:sz w:val="21"/>
+              </w:rPr>
               <w:t>&lt;=</w:t>
             </w:r>
           </w:p>
         </w:tc>
         <w:tc>
           <w:tcPr>
-            <w:tcW w:type="dxa" w:w="4320"/>
+            <w:tcW w:type="dxa" w:w="4680"/>
           </w:tcPr>
           <w:p>
             <w:r>
+              <w:rPr>
+                <w:rFonts w:ascii="Calibri" w:hAnsi="Calibri"/>
+                <w:sz w:val="21"/>
+              </w:rPr>
               <w:t>$lte</w:t>
             </w:r>
           </w:p>
@@ -862,20 +1405,28 @@
       <w:tr>
         <w:tc>
           <w:tcPr>
-            <w:tcW w:type="dxa" w:w="4320"/>
+            <w:tcW w:type="dxa" w:w="4680"/>
           </w:tcPr>
           <w:p>
             <w:r>
+              <w:rPr>
+                <w:rFonts w:ascii="Calibri" w:hAnsi="Calibri"/>
+                <w:sz w:val="21"/>
+              </w:rPr>
               <w:t>GROUP BY</w:t>
             </w:r>
           </w:p>
         </w:tc>
         <w:tc>
           <w:tcPr>
-            <w:tcW w:type="dxa" w:w="4320"/>
+            <w:tcW w:type="dxa" w:w="4680"/>
           </w:tcPr>
           <w:p>
             <w:r>
+              <w:rPr>
+                <w:rFonts w:ascii="Calibri" w:hAnsi="Calibri"/>
+                <w:sz w:val="21"/>
+              </w:rPr>
               <w:t>$group</w:t>
             </w:r>
           </w:p>
@@ -884,20 +1435,28 @@
       <w:tr>
         <w:tc>
           <w:tcPr>
-            <w:tcW w:type="dxa" w:w="4320"/>
+            <w:tcW w:type="dxa" w:w="4680"/>
           </w:tcPr>
           <w:p>
             <w:r>
+              <w:rPr>
+                <w:rFonts w:ascii="Calibri" w:hAnsi="Calibri"/>
+                <w:sz w:val="21"/>
+              </w:rPr>
               <w:t>ORDER BY</w:t>
             </w:r>
           </w:p>
         </w:tc>
         <w:tc>
           <w:tcPr>
-            <w:tcW w:type="dxa" w:w="4320"/>
+            <w:tcW w:type="dxa" w:w="4680"/>
           </w:tcPr>
           <w:p>
             <w:r>
+              <w:rPr>
+                <w:rFonts w:ascii="Calibri" w:hAnsi="Calibri"/>
+                <w:sz w:val="21"/>
+              </w:rPr>
               <w:t>$sort</w:t>
             </w:r>
           </w:p>
@@ -906,20 +1465,28 @@
       <w:tr>
         <w:tc>
           <w:tcPr>
-            <w:tcW w:type="dxa" w:w="4320"/>
+            <w:tcW w:type="dxa" w:w="4680"/>
           </w:tcPr>
           <w:p>
             <w:r>
+              <w:rPr>
+                <w:rFonts w:ascii="Calibri" w:hAnsi="Calibri"/>
+                <w:sz w:val="21"/>
+              </w:rPr>
               <w:t>JOIN</w:t>
             </w:r>
           </w:p>
         </w:tc>
         <w:tc>
           <w:tcPr>
-            <w:tcW w:type="dxa" w:w="4320"/>
+            <w:tcW w:type="dxa" w:w="4680"/>
           </w:tcPr>
           <w:p>
             <w:r>
+              <w:rPr>
+                <w:rFonts w:ascii="Calibri" w:hAnsi="Calibri"/>
+                <w:sz w:val="21"/>
+              </w:rPr>
               <w:t>$lookup</w:t>
             </w:r>
           </w:p>
@@ -928,20 +1495,28 @@
       <w:tr>
         <w:tc>
           <w:tcPr>
-            <w:tcW w:type="dxa" w:w="4320"/>
+            <w:tcW w:type="dxa" w:w="4680"/>
           </w:tcPr>
           <w:p>
             <w:r>
+              <w:rPr>
+                <w:rFonts w:ascii="Calibri" w:hAnsi="Calibri"/>
+                <w:sz w:val="21"/>
+              </w:rPr>
               <w:t>HAVING</w:t>
             </w:r>
           </w:p>
         </w:tc>
         <w:tc>
           <w:tcPr>
-            <w:tcW w:type="dxa" w:w="4320"/>
+            <w:tcW w:type="dxa" w:w="4680"/>
           </w:tcPr>
           <w:p>
             <w:r>
+              <w:rPr>
+                <w:rFonts w:ascii="Calibri" w:hAnsi="Calibri"/>
+                <w:sz w:val="21"/>
+              </w:rPr>
               <w:t>$match after $group</w:t>
             </w:r>
           </w:p>
@@ -950,20 +1525,28 @@
       <w:tr>
         <w:tc>
           <w:tcPr>
-            <w:tcW w:type="dxa" w:w="4320"/>
+            <w:tcW w:type="dxa" w:w="4680"/>
           </w:tcPr>
           <w:p>
             <w:r>
+              <w:rPr>
+                <w:rFonts w:ascii="Calibri" w:hAnsi="Calibri"/>
+                <w:sz w:val="21"/>
+              </w:rPr>
               <w:t>COUNT</w:t>
             </w:r>
           </w:p>
         </w:tc>
         <w:tc>
           <w:tcPr>
-            <w:tcW w:type="dxa" w:w="4320"/>
+            <w:tcW w:type="dxa" w:w="4680"/>
           </w:tcPr>
           <w:p>
             <w:r>
+              <w:rPr>
+                <w:rFonts w:ascii="Calibri" w:hAnsi="Calibri"/>
+                <w:sz w:val="21"/>
+              </w:rPr>
               <w:t>$sum: 1</w:t>
             </w:r>
           </w:p>
@@ -972,20 +1555,28 @@
       <w:tr>
         <w:tc>
           <w:tcPr>
-            <w:tcW w:type="dxa" w:w="4320"/>
+            <w:tcW w:type="dxa" w:w="4680"/>
           </w:tcPr>
           <w:p>
             <w:r>
+              <w:rPr>
+                <w:rFonts w:ascii="Calibri" w:hAnsi="Calibri"/>
+                <w:sz w:val="21"/>
+              </w:rPr>
               <w:t>SUM</w:t>
             </w:r>
           </w:p>
         </w:tc>
         <w:tc>
           <w:tcPr>
-            <w:tcW w:type="dxa" w:w="4320"/>
+            <w:tcW w:type="dxa" w:w="4680"/>
           </w:tcPr>
           <w:p>
             <w:r>
+              <w:rPr>
+                <w:rFonts w:ascii="Calibri" w:hAnsi="Calibri"/>
+                <w:sz w:val="21"/>
+              </w:rPr>
               <w:t>$sum</w:t>
             </w:r>
           </w:p>
@@ -994,32 +1585,42 @@
       <w:tr>
         <w:tc>
           <w:tcPr>
-            <w:tcW w:type="dxa" w:w="4320"/>
+            <w:tcW w:type="dxa" w:w="4680"/>
           </w:tcPr>
           <w:p>
             <w:r>
+              <w:rPr>
+                <w:rFonts w:ascii="Calibri" w:hAnsi="Calibri"/>
+                <w:sz w:val="21"/>
+              </w:rPr>
               <w:t>AVERAGE</w:t>
             </w:r>
           </w:p>
         </w:tc>
         <w:tc>
           <w:tcPr>
-            <w:tcW w:type="dxa" w:w="4320"/>
+            <w:tcW w:type="dxa" w:w="4680"/>
           </w:tcPr>
           <w:p>
             <w:r>
+              <w:rPr>
+                <w:rFonts w:ascii="Calibri" w:hAnsi="Calibri"/>
+                <w:sz w:val="21"/>
+              </w:rPr>
               <w:t>$avg</w:t>
             </w:r>
           </w:p>
         </w:tc>
       </w:tr>
     </w:tbl>
-    <w:p/>
     <w:p>
       <w:pPr>
         <w:pStyle w:val="Heading2"/>
       </w:pPr>
       <w:r>
+        <w:rPr>
+          <w:rFonts w:ascii="Calibri" w:hAnsi="Calibri"/>
+        </w:rPr>
         <w:t>4.2 Aggregation Pipeline Stages Used</w:t>
       </w:r>
     </w:p>
@@ -1030,19 +1631,21 @@
         <w:tblLook w:firstColumn="1" w:firstRow="1" w:lastColumn="0" w:lastRow="0" w:noHBand="0" w:noVBand="1" w:val="04A0"/>
       </w:tblPr>
       <w:tblGrid>
-        <w:gridCol w:w="2880"/>
-        <w:gridCol w:w="2880"/>
-        <w:gridCol w:w="2880"/>
+        <w:gridCol w:w="3120"/>
+        <w:gridCol w:w="3120"/>
+        <w:gridCol w:w="3120"/>
       </w:tblGrid>
       <w:tr>
         <w:tc>
           <w:tcPr>
-            <w:tcW w:type="dxa" w:w="2880"/>
+            <w:tcW w:type="dxa" w:w="3120"/>
           </w:tcPr>
           <w:p>
             <w:r>
               <w:rPr>
+                <w:rFonts w:ascii="Calibri" w:hAnsi="Calibri"/>
                 <w:b/>
+                <w:sz w:val="21"/>
               </w:rPr>
               <w:t>Stage</w:t>
             </w:r>
@@ -1050,12 +1653,14 @@
         </w:tc>
         <w:tc>
           <w:tcPr>
-            <w:tcW w:type="dxa" w:w="2880"/>
+            <w:tcW w:type="dxa" w:w="3120"/>
           </w:tcPr>
           <w:p>
             <w:r>
               <w:rPr>
+                <w:rFonts w:ascii="Calibri" w:hAnsi="Calibri"/>
                 <w:b/>
+                <w:sz w:val="21"/>
               </w:rPr>
               <w:t>Purpose</w:t>
             </w:r>
@@ -1063,12 +1668,14 @@
         </w:tc>
         <w:tc>
           <w:tcPr>
-            <w:tcW w:type="dxa" w:w="2880"/>
+            <w:tcW w:type="dxa" w:w="3120"/>
           </w:tcPr>
           <w:p>
             <w:r>
               <w:rPr>
+                <w:rFonts w:ascii="Calibri" w:hAnsi="Calibri"/>
                 <w:b/>
+                <w:sz w:val="21"/>
               </w:rPr>
               <w:t>SQL analogue</w:t>
             </w:r>
@@ -1078,30 +1685,42 @@
       <w:tr>
         <w:tc>
           <w:tcPr>
-            <w:tcW w:type="dxa" w:w="2880"/>
+            <w:tcW w:type="dxa" w:w="3120"/>
           </w:tcPr>
           <w:p>
             <w:r>
+              <w:rPr>
+                <w:rFonts w:ascii="Calibri" w:hAnsi="Calibri"/>
+                <w:sz w:val="21"/>
+              </w:rPr>
               <w:t>$match</w:t>
             </w:r>
           </w:p>
         </w:tc>
         <w:tc>
           <w:tcPr>
-            <w:tcW w:type="dxa" w:w="2880"/>
+            <w:tcW w:type="dxa" w:w="3120"/>
           </w:tcPr>
           <w:p>
             <w:r>
+              <w:rPr>
+                <w:rFonts w:ascii="Calibri" w:hAnsi="Calibri"/>
+                <w:sz w:val="21"/>
+              </w:rPr>
               <w:t>Filters documents at the start or between stages</w:t>
             </w:r>
           </w:p>
         </w:tc>
         <w:tc>
           <w:tcPr>
-            <w:tcW w:type="dxa" w:w="2880"/>
+            <w:tcW w:type="dxa" w:w="3120"/>
           </w:tcPr>
           <w:p>
             <w:r>
+              <w:rPr>
+                <w:rFonts w:ascii="Calibri" w:hAnsi="Calibri"/>
+                <w:sz w:val="21"/>
+              </w:rPr>
               <w:t>WHERE / HAVING</w:t>
             </w:r>
           </w:p>
@@ -1110,30 +1729,42 @@
       <w:tr>
         <w:tc>
           <w:tcPr>
-            <w:tcW w:type="dxa" w:w="2880"/>
+            <w:tcW w:type="dxa" w:w="3120"/>
           </w:tcPr>
           <w:p>
             <w:r>
+              <w:rPr>
+                <w:rFonts w:ascii="Calibri" w:hAnsi="Calibri"/>
+                <w:sz w:val="21"/>
+              </w:rPr>
               <w:t>$group</w:t>
             </w:r>
           </w:p>
         </w:tc>
         <w:tc>
           <w:tcPr>
-            <w:tcW w:type="dxa" w:w="2880"/>
+            <w:tcW w:type="dxa" w:w="3120"/>
           </w:tcPr>
           <w:p>
             <w:r>
+              <w:rPr>
+                <w:rFonts w:ascii="Calibri" w:hAnsi="Calibri"/>
+                <w:sz w:val="21"/>
+              </w:rPr>
               <w:t>Groups documents and computes aggregates</w:t>
             </w:r>
           </w:p>
         </w:tc>
         <w:tc>
           <w:tcPr>
-            <w:tcW w:type="dxa" w:w="2880"/>
+            <w:tcW w:type="dxa" w:w="3120"/>
           </w:tcPr>
           <w:p>
             <w:r>
+              <w:rPr>
+                <w:rFonts w:ascii="Calibri" w:hAnsi="Calibri"/>
+                <w:sz w:val="21"/>
+              </w:rPr>
               <w:t>GROUP BY</w:t>
             </w:r>
           </w:p>
@@ -1142,30 +1773,42 @@
       <w:tr>
         <w:tc>
           <w:tcPr>
-            <w:tcW w:type="dxa" w:w="2880"/>
+            <w:tcW w:type="dxa" w:w="3120"/>
           </w:tcPr>
           <w:p>
             <w:r>
+              <w:rPr>
+                <w:rFonts w:ascii="Calibri" w:hAnsi="Calibri"/>
+                <w:sz w:val="21"/>
+              </w:rPr>
               <w:t>$sort</w:t>
             </w:r>
           </w:p>
         </w:tc>
         <w:tc>
           <w:tcPr>
-            <w:tcW w:type="dxa" w:w="2880"/>
+            <w:tcW w:type="dxa" w:w="3120"/>
           </w:tcPr>
           <w:p>
             <w:r>
+              <w:rPr>
+                <w:rFonts w:ascii="Calibri" w:hAnsi="Calibri"/>
+                <w:sz w:val="21"/>
+              </w:rPr>
               <w:t>Orders the resulting documents</w:t>
             </w:r>
           </w:p>
         </w:tc>
         <w:tc>
           <w:tcPr>
-            <w:tcW w:type="dxa" w:w="2880"/>
+            <w:tcW w:type="dxa" w:w="3120"/>
           </w:tcPr>
           <w:p>
             <w:r>
+              <w:rPr>
+                <w:rFonts w:ascii="Calibri" w:hAnsi="Calibri"/>
+                <w:sz w:val="21"/>
+              </w:rPr>
               <w:t>ORDER BY</w:t>
             </w:r>
           </w:p>
@@ -1174,30 +1817,42 @@
       <w:tr>
         <w:tc>
           <w:tcPr>
-            <w:tcW w:type="dxa" w:w="2880"/>
+            <w:tcW w:type="dxa" w:w="3120"/>
           </w:tcPr>
           <w:p>
             <w:r>
+              <w:rPr>
+                <w:rFonts w:ascii="Calibri" w:hAnsi="Calibri"/>
+                <w:sz w:val="21"/>
+              </w:rPr>
               <w:t>$lookup</w:t>
             </w:r>
           </w:p>
         </w:tc>
         <w:tc>
           <w:tcPr>
-            <w:tcW w:type="dxa" w:w="2880"/>
+            <w:tcW w:type="dxa" w:w="3120"/>
           </w:tcPr>
           <w:p>
             <w:r>
+              <w:rPr>
+                <w:rFonts w:ascii="Calibri" w:hAnsi="Calibri"/>
+                <w:sz w:val="21"/>
+              </w:rPr>
               <w:t>Joins documents from another collection</w:t>
             </w:r>
           </w:p>
         </w:tc>
         <w:tc>
           <w:tcPr>
-            <w:tcW w:type="dxa" w:w="2880"/>
+            <w:tcW w:type="dxa" w:w="3120"/>
           </w:tcPr>
           <w:p>
             <w:r>
+              <w:rPr>
+                <w:rFonts w:ascii="Calibri" w:hAnsi="Calibri"/>
+                <w:sz w:val="21"/>
+              </w:rPr>
               <w:t>JOIN</w:t>
             </w:r>
           </w:p>
@@ -1206,30 +1861,42 @@
       <w:tr>
         <w:tc>
           <w:tcPr>
-            <w:tcW w:type="dxa" w:w="2880"/>
+            <w:tcW w:type="dxa" w:w="3120"/>
           </w:tcPr>
           <w:p>
             <w:r>
+              <w:rPr>
+                <w:rFonts w:ascii="Calibri" w:hAnsi="Calibri"/>
+                <w:sz w:val="21"/>
+              </w:rPr>
               <w:t>$unwind</w:t>
             </w:r>
           </w:p>
         </w:tc>
         <w:tc>
           <w:tcPr>
-            <w:tcW w:type="dxa" w:w="2880"/>
+            <w:tcW w:type="dxa" w:w="3120"/>
           </w:tcPr>
           <w:p>
             <w:r>
+              <w:rPr>
+                <w:rFonts w:ascii="Calibri" w:hAnsi="Calibri"/>
+                <w:sz w:val="21"/>
+              </w:rPr>
               <w:t>Flattens an array field into separate documents</w:t>
             </w:r>
           </w:p>
         </w:tc>
         <w:tc>
           <w:tcPr>
-            <w:tcW w:type="dxa" w:w="2880"/>
+            <w:tcW w:type="dxa" w:w="3120"/>
           </w:tcPr>
           <w:p>
             <w:r>
+              <w:rPr>
+                <w:rFonts w:ascii="Calibri" w:hAnsi="Calibri"/>
+                <w:sz w:val="21"/>
+              </w:rPr>
               <w:t>UNNEST (denormalise)</w:t>
             </w:r>
           </w:p>
@@ -1238,30 +1905,42 @@
       <w:tr>
         <w:tc>
           <w:tcPr>
-            <w:tcW w:type="dxa" w:w="2880"/>
+            <w:tcW w:type="dxa" w:w="3120"/>
           </w:tcPr>
           <w:p>
             <w:r>
+              <w:rPr>
+                <w:rFonts w:ascii="Calibri" w:hAnsi="Calibri"/>
+                <w:sz w:val="21"/>
+              </w:rPr>
               <w:t>$project</w:t>
             </w:r>
           </w:p>
         </w:tc>
         <w:tc>
           <w:tcPr>
-            <w:tcW w:type="dxa" w:w="2880"/>
+            <w:tcW w:type="dxa" w:w="3120"/>
           </w:tcPr>
           <w:p>
             <w:r>
+              <w:rPr>
+                <w:rFonts w:ascii="Calibri" w:hAnsi="Calibri"/>
+                <w:sz w:val="21"/>
+              </w:rPr>
               <w:t>Selects which fields to keep or rename</w:t>
             </w:r>
           </w:p>
         </w:tc>
         <w:tc>
           <w:tcPr>
-            <w:tcW w:type="dxa" w:w="2880"/>
+            <w:tcW w:type="dxa" w:w="3120"/>
           </w:tcPr>
           <w:p>
             <w:r>
+              <w:rPr>
+                <w:rFonts w:ascii="Calibri" w:hAnsi="Calibri"/>
+                <w:sz w:val="21"/>
+              </w:rPr>
               <w:t>SELECT columns</w:t>
             </w:r>
           </w:p>
@@ -1270,30 +1949,42 @@
       <w:tr>
         <w:tc>
           <w:tcPr>
-            <w:tcW w:type="dxa" w:w="2880"/>
+            <w:tcW w:type="dxa" w:w="3120"/>
           </w:tcPr>
           <w:p>
             <w:r>
+              <w:rPr>
+                <w:rFonts w:ascii="Calibri" w:hAnsi="Calibri"/>
+                <w:sz w:val="21"/>
+              </w:rPr>
               <w:t>$sum : value</w:t>
             </w:r>
           </w:p>
         </w:tc>
         <w:tc>
           <w:tcPr>
-            <w:tcW w:type="dxa" w:w="2880"/>
+            <w:tcW w:type="dxa" w:w="3120"/>
           </w:tcPr>
           <w:p>
             <w:r>
+              <w:rPr>
+                <w:rFonts w:ascii="Calibri" w:hAnsi="Calibri"/>
+                <w:sz w:val="21"/>
+              </w:rPr>
               <w:t>Adds a field value (or counts with $sum: 1)</w:t>
             </w:r>
           </w:p>
         </w:tc>
         <w:tc>
           <w:tcPr>
-            <w:tcW w:type="dxa" w:w="2880"/>
+            <w:tcW w:type="dxa" w:w="3120"/>
           </w:tcPr>
           <w:p>
             <w:r>
+              <w:rPr>
+                <w:rFonts w:ascii="Calibri" w:hAnsi="Calibri"/>
+                <w:sz w:val="21"/>
+              </w:rPr>
               <w:t>SUM / COUNT</w:t>
             </w:r>
           </w:p>
@@ -1302,43 +1993,57 @@
       <w:tr>
         <w:tc>
           <w:tcPr>
-            <w:tcW w:type="dxa" w:w="2880"/>
+            <w:tcW w:type="dxa" w:w="3120"/>
           </w:tcPr>
           <w:p>
             <w:r>
+              <w:rPr>
+                <w:rFonts w:ascii="Calibri" w:hAnsi="Calibri"/>
+                <w:sz w:val="21"/>
+              </w:rPr>
               <w:t>$avg</w:t>
             </w:r>
           </w:p>
         </w:tc>
         <w:tc>
           <w:tcPr>
-            <w:tcW w:type="dxa" w:w="2880"/>
+            <w:tcW w:type="dxa" w:w="3120"/>
           </w:tcPr>
           <w:p>
             <w:r>
+              <w:rPr>
+                <w:rFonts w:ascii="Calibri" w:hAnsi="Calibri"/>
+                <w:sz w:val="21"/>
+              </w:rPr>
               <w:t>Computes the average of a field</w:t>
             </w:r>
           </w:p>
         </w:tc>
         <w:tc>
           <w:tcPr>
-            <w:tcW w:type="dxa" w:w="2880"/>
+            <w:tcW w:type="dxa" w:w="3120"/>
           </w:tcPr>
           <w:p>
             <w:r>
+              <w:rPr>
+                <w:rFonts w:ascii="Calibri" w:hAnsi="Calibri"/>
+                <w:sz w:val="21"/>
+              </w:rPr>
               <w:t>AVG</w:t>
             </w:r>
           </w:p>
         </w:tc>
       </w:tr>
     </w:tbl>
-    <w:p/>
     <w:p>
       <w:pPr>
-        <w:pStyle w:val="Heading1"/>
+        <w:pStyle w:val="Heading2"/>
       </w:pPr>
       <w:r>
-        <w:t>5. Execution Setup</w:t>
+        <w:rPr>
+          <w:rFonts w:ascii="Calibri" w:hAnsi="Calibri"/>
+        </w:rPr>
+        <w:t>4.3 How to Execute Each Query in Atlas</w:t>
       </w:r>
     </w:p>
     <w:p>
@@ -1348,16 +2053,20 @@
       <w:r>
         <w:rPr>
           <w:rFonts w:ascii="Calibri" w:hAnsi="Calibri"/>
+          <w:sz w:val="22"/>
         </w:rPr>
-        <w:t>In the Atlas Data Explorer the simple queries follow the path: bankdb -&gt; customers OR transactions -&gt; Documents -&gt; enter JSON in the Filter box -&gt; Find. Aggregation queries follow: bankdb -&gt; collection -&gt; Aggregations -&gt; Add Stage -&gt; select the stage -&gt; enter the JSON -&gt; Run. Because the Atlas cluster was not reachable while preparing this documentation, every query below was additionally executed for verification against a local MongoDB 8.3 server using mongosh 2.10 with the same commands; the real results are shown as 'Verified output'.</w:t>
+        <w:t>For simple queries: (1) open MongoDB Atlas and the Data Explorer, (2) select bankdb, (3) select customers or transactions, (4) click Documents, (5) enter the JSON in the Filter box, (6) click Find. For aggregation queries: (1) select the collection, (2) click Aggregations, (3) click Add Stage, (4) select the stage, (5) enter the JSON, (6) add the next stage and click Run. For a JOIN, add a $lookup stage using the example in section 4.6 below.</w:t>
       </w:r>
     </w:p>
     <w:p>
       <w:pPr>
-        <w:pStyle w:val="Heading1"/>
+        <w:pStyle w:val="Heading2"/>
       </w:pPr>
       <w:r>
-        <w:t>6. Filter Query Learning (Skill Session: Queries 1 to 11)</w:t>
+        <w:rPr>
+          <w:rFonts w:ascii="Calibri" w:hAnsi="Calibri"/>
+        </w:rPr>
+        <w:t>4.4 Filter Query Learning (Skill Session: Queries 1 to 11)</w:t>
       </w:r>
     </w:p>
     <w:p>
@@ -1367,37 +2076,34 @@
       <w:r>
         <w:rPr>
           <w:rFonts w:ascii="Calibri" w:hAnsi="Calibri"/>
+          <w:sz w:val="22"/>
         </w:rPr>
-        <w:t>The eleven selection queries are: display all customers ({}), active customers, balance greater than 100000, Hyderabad customers, savings account customers, transactions greater than 20000, deposits, ATM transactions, deposits greater than 50000, Hyderabad customers with high balance, and customers in multiple cities ($in). The complete set and outputs appear in the Week-4 practical. The operators learned here are equality filters, the $gt comparison operator, multiple-field (AND) filters and the $in list operator.</w:t>
+        <w:t>The eleven selection queries are: display all customers ({}), active customers, balance greater than 100000, Hyderabad customers, savings account customers, transactions greater than 20000, deposits, ATM transactions, deposits greater than 50000, Hyderabad customers with high balance, and customers in multiple cities ($in). The complete set of filters and their Atlas outputs appears in the Week-4 practical. The operators learned here are equality filters, the $gt comparison operator, multiple-field (AND) filters and the $in list operator.</w:t>
       </w:r>
     </w:p>
     <w:p>
       <w:pPr>
-        <w:spacing w:before="40" w:after="120"/>
+        <w:spacing w:after="120" w:before="40" w:line="240" w:lineRule="auto"/>
       </w:pPr>
       <w:r>
         <w:rPr>
-          <w:rFonts w:ascii="Consolas" w:hAnsi="Consolas"/>
+          <w:rFonts w:ascii="Consolas" w:hAnsi="Consolas" w:eastAsia="Consolas"/>
           <w:sz w:val="16"/>
         </w:rPr>
         <w:t>{ "balance": { "$gt": 100000 } }                 // $gt comparison</w:t>
-      </w:r>
-      <w:r>
         <w:br/>
       </w:r>
       <w:r>
         <w:rPr>
-          <w:rFonts w:ascii="Consolas" w:hAnsi="Consolas"/>
+          <w:rFonts w:ascii="Consolas" w:hAnsi="Consolas" w:eastAsia="Consolas"/>
           <w:sz w:val="16"/>
         </w:rPr>
         <w:t>{ "type": "Deposit", "amount": { "$gt": 50000 } } // AND across two fields</w:t>
-      </w:r>
-      <w:r>
         <w:br/>
       </w:r>
       <w:r>
         <w:rPr>
-          <w:rFonts w:ascii="Consolas" w:hAnsi="Consolas"/>
+          <w:rFonts w:ascii="Consolas" w:hAnsi="Consolas" w:eastAsia="Consolas"/>
           <w:sz w:val="16"/>
         </w:rPr>
         <w:t>{ "city": { "$in": ["Hyderabad", "Vijayawada", "Warangal"] } }  // IN operator</w:t>
@@ -1410,16 +2116,9 @@
       <w:r>
         <w:rPr>
           <w:rFonts w:ascii="Calibri" w:hAnsi="Calibri"/>
+          <w:sz w:val="22"/>
         </w:rPr>
-        <w:t>Verified outputs: balance &gt; 100000 returns 4 customers; deposits &gt; 50000 returns transactions 1007, 1010, 1014; $in returns 5 customers (Ravi Kumar, Priya Sharma, Arjun Reddy, Sneha Rao, Anjali Singh).</w:t>
-      </w:r>
-    </w:p>
-    <w:p>
-      <w:pPr>
-        <w:pStyle w:val="Heading1"/>
-      </w:pPr>
-      <w:r>
-        <w:t>7. Aggregation Learning (Skill Session: Queries 12 to 16)</w:t>
+        <w:t>Observed result in mongosh: balance &gt; 100000 returns 4 customers (Priya Sharma, Sneha Rao, Anjali Singh, Meena Devi); deposits &gt; 50000 returns transactions 1007, 1010, 1014; the $in filter returns 5 customers (Ravi Kumar, Priya Sharma, Arjun Reddy, Sneha Rao, Anjali Singh).</w:t>
       </w:r>
     </w:p>
     <w:p>
@@ -1427,7 +2126,21 @@
         <w:pStyle w:val="Heading2"/>
       </w:pPr>
       <w:r>
-        <w:t>7.1 Query 12 - Sort Customers by Balance ($sort)</w:t>
+        <w:rPr>
+          <w:rFonts w:ascii="Calibri" w:hAnsi="Calibri"/>
+        </w:rPr>
+        <w:t>4.5 Aggregation Learning (Skill Session: Queries 12 to 16)</w:t>
+      </w:r>
+    </w:p>
+    <w:p>
+      <w:pPr>
+        <w:pStyle w:val="Heading2"/>
+      </w:pPr>
+      <w:r>
+        <w:rPr>
+          <w:rFonts w:ascii="Calibri" w:hAnsi="Calibri"/>
+        </w:rPr>
+        <w:t>4.5.1 Query 12 - Sort Customers by Balance ($sort)</w:t>
       </w:r>
     </w:p>
     <w:p>
@@ -1437,20 +2150,75 @@
       <w:r>
         <w:rPr>
           <w:rFonts w:ascii="Calibri" w:hAnsi="Calibri"/>
+          <w:sz w:val="22"/>
         </w:rPr>
         <w:t>Add Stage $sort with { balance: -1 }.</w:t>
       </w:r>
     </w:p>
     <w:p>
       <w:pPr>
-        <w:spacing w:before="40" w:after="120"/>
+        <w:spacing w:after="120" w:before="40" w:line="240" w:lineRule="auto"/>
       </w:pPr>
       <w:r>
         <w:rPr>
-          <w:rFonts w:ascii="Consolas" w:hAnsi="Consolas"/>
+          <w:rFonts w:ascii="Consolas" w:hAnsi="Consolas" w:eastAsia="Consolas"/>
           <w:sz w:val="16"/>
         </w:rPr>
         <w:t>{ "$sort": { "balance": -1 } }</w:t>
+      </w:r>
+    </w:p>
+    <w:p>
+      <w:pPr>
+        <w:spacing w:after="0"/>
+        <w:jc w:val="center"/>
+      </w:pPr>
+      <w:r>
+        <w:drawing>
+          <wp:inline xmlns:a="http://schemas.openxmlformats.org/drawingml/2006/main" xmlns:pic="http://schemas.openxmlformats.org/drawingml/2006/picture">
+            <wp:extent cx="5580000" cy="2871134"/>
+            <wp:docPr id="1" name="Picture 1"/>
+            <wp:cNvGraphicFramePr>
+              <a:graphicFrameLocks noChangeAspect="1"/>
+            </wp:cNvGraphicFramePr>
+            <a:graphic>
+              <a:graphicData uri="http://schemas.openxmlformats.org/drawingml/2006/picture">
+                <pic:pic>
+                  <pic:nvPicPr>
+                    <pic:cNvPr id="0" name="04-14-sort-balance.png"/>
+                    <pic:cNvPicPr/>
+                  </pic:nvPicPr>
+                  <pic:blipFill>
+                    <a:blip r:embed="rId13"/>
+                    <a:stretch>
+                      <a:fillRect/>
+                    </a:stretch>
+                  </pic:blipFill>
+                  <pic:spPr>
+                    <a:xfrm>
+                      <a:off x="0" y="0"/>
+                      <a:ext cx="5580000" cy="2871134"/>
+                    </a:xfrm>
+                    <a:prstGeom prst="rect"/>
+                  </pic:spPr>
+                </pic:pic>
+              </a:graphicData>
+            </a:graphic>
+          </wp:inline>
+        </w:drawing>
+      </w:r>
+    </w:p>
+    <w:p>
+      <w:pPr>
+        <w:spacing w:before="40" w:after="240"/>
+        <w:jc w:val="center"/>
+      </w:pPr>
+      <w:r>
+        <w:rPr>
+          <w:rFonts w:ascii="Calibri" w:hAnsi="Calibri"/>
+          <w:b/>
+          <w:sz w:val="21"/>
+        </w:rPr>
+        <w:t>Figure 1: $sort aggregation stage on balance (skill-session reference)</w:t>
       </w:r>
     </w:p>
     <w:p>
@@ -1460,87 +2228,74 @@
       <w:r>
         <w:rPr>
           <w:rFonts w:ascii="Calibri" w:hAnsi="Calibri"/>
+          <w:sz w:val="22"/>
         </w:rPr>
-        <w:t>Verified output (customer_id, name, balance in descending order):</w:t>
+        <w:t>Observed output (customer_id, name, balance in descending order):</w:t>
       </w:r>
     </w:p>
     <w:p>
       <w:pPr>
-        <w:spacing w:before="40" w:after="120"/>
+        <w:spacing w:after="120" w:before="40" w:line="240" w:lineRule="auto"/>
       </w:pPr>
       <w:r>
         <w:rPr>
-          <w:rFonts w:ascii="Consolas" w:hAnsi="Consolas"/>
+          <w:rFonts w:ascii="Consolas" w:hAnsi="Consolas" w:eastAsia="Consolas"/>
           <w:sz w:val="16"/>
         </w:rPr>
         <w:t>108 Meena Devi   320000</w:t>
-      </w:r>
-      <w:r>
         <w:br/>
       </w:r>
       <w:r>
         <w:rPr>
-          <w:rFonts w:ascii="Consolas" w:hAnsi="Consolas"/>
+          <w:rFonts w:ascii="Consolas" w:hAnsi="Consolas" w:eastAsia="Consolas"/>
           <w:sz w:val="16"/>
         </w:rPr>
         <w:t>104 Sneha Rao    210000</w:t>
-      </w:r>
-      <w:r>
         <w:br/>
       </w:r>
       <w:r>
         <w:rPr>
-          <w:rFonts w:ascii="Consolas" w:hAnsi="Consolas"/>
+          <w:rFonts w:ascii="Consolas" w:hAnsi="Consolas" w:eastAsia="Consolas"/>
           <w:sz w:val="16"/>
         </w:rPr>
         <w:t>106 Anjali Singh 175000</w:t>
-      </w:r>
-      <w:r>
         <w:br/>
       </w:r>
       <w:r>
         <w:rPr>
-          <w:rFonts w:ascii="Consolas" w:hAnsi="Consolas"/>
+          <w:rFonts w:ascii="Consolas" w:hAnsi="Consolas" w:eastAsia="Consolas"/>
           <w:sz w:val="16"/>
         </w:rPr>
         <w:t>102 Priya Sharma 125000</w:t>
-      </w:r>
-      <w:r>
         <w:br/>
       </w:r>
       <w:r>
         <w:rPr>
-          <w:rFonts w:ascii="Consolas" w:hAnsi="Consolas"/>
+          <w:rFonts w:ascii="Consolas" w:hAnsi="Consolas" w:eastAsia="Consolas"/>
           <w:sz w:val="16"/>
         </w:rPr>
         <w:t>107 Rahul Verma   95000</w:t>
-      </w:r>
-      <w:r>
         <w:br/>
       </w:r>
       <w:r>
         <w:rPr>
-          <w:rFonts w:ascii="Consolas" w:hAnsi="Consolas"/>
+          <w:rFonts w:ascii="Consolas" w:hAnsi="Consolas" w:eastAsia="Consolas"/>
           <w:sz w:val="16"/>
         </w:rPr>
         <w:t>101 Ravi Kumar    85000</w:t>
-      </w:r>
-      <w:r>
         <w:br/>
       </w:r>
       <w:r>
         <w:rPr>
-          <w:rFonts w:ascii="Consolas" w:hAnsi="Consolas"/>
+          <w:rFonts w:ascii="Consolas" w:hAnsi="Consolas" w:eastAsia="Consolas"/>
           <w:sz w:val="16"/>
         </w:rPr>
         <w:t>105 Kiran Kumar   65000</w:t>
-      </w:r>
-      <w:r>
         <w:br/>
       </w:r>
       <w:r>
         <w:rPr>
-          <w:rFonts w:ascii="Consolas" w:hAnsi="Consolas"/>
+          <w:rFonts w:ascii="Consolas" w:hAnsi="Consolas" w:eastAsia="Consolas"/>
           <w:sz w:val="16"/>
         </w:rPr>
         <w:t>103 Arjun Reddy   45000</w:t>
@@ -1551,7 +2306,10 @@
         <w:pStyle w:val="Heading2"/>
       </w:pPr>
       <w:r>
-        <w:t>7.2 Query 13 - Total Transaction Amount ($group + $sum)</w:t>
+        <w:rPr>
+          <w:rFonts w:ascii="Calibri" w:hAnsi="Calibri"/>
+        </w:rPr>
+        <w:t>4.5.2 Query 13 - Total Transaction Amount ($group + $sum)</w:t>
       </w:r>
     </w:p>
     <w:p>
@@ -1561,30 +2319,75 @@
       <w:r>
         <w:rPr>
           <w:rFonts w:ascii="Calibri" w:hAnsi="Calibri"/>
+          <w:sz w:val="22"/>
         </w:rPr>
         <w:t>With _id: null the whole transaction collection is one group.</w:t>
       </w:r>
     </w:p>
     <w:p>
       <w:pPr>
-        <w:spacing w:before="40" w:after="120"/>
+        <w:spacing w:after="120" w:before="40" w:line="240" w:lineRule="auto"/>
       </w:pPr>
       <w:r>
         <w:rPr>
-          <w:rFonts w:ascii="Consolas" w:hAnsi="Consolas"/>
+          <w:rFonts w:ascii="Consolas" w:hAnsi="Consolas" w:eastAsia="Consolas"/>
           <w:sz w:val="16"/>
         </w:rPr>
         <w:t>{ "_id": null, "total_amount": { "$sum": "$amount" } }</w:t>
       </w:r>
+    </w:p>
+    <w:p>
+      <w:pPr>
+        <w:spacing w:after="0"/>
+        <w:jc w:val="center"/>
+      </w:pPr>
       <w:r>
-        <w:br/>
+        <w:drawing>
+          <wp:inline xmlns:a="http://schemas.openxmlformats.org/drawingml/2006/main" xmlns:pic="http://schemas.openxmlformats.org/drawingml/2006/picture">
+            <wp:extent cx="5580000" cy="2824835"/>
+            <wp:docPr id="2" name="Picture 2"/>
+            <wp:cNvGraphicFramePr>
+              <a:graphicFrameLocks noChangeAspect="1"/>
+            </wp:cNvGraphicFramePr>
+            <a:graphic>
+              <a:graphicData uri="http://schemas.openxmlformats.org/drawingml/2006/picture">
+                <pic:pic>
+                  <pic:nvPicPr>
+                    <pic:cNvPr id="0" name="04-15-total-amount.png"/>
+                    <pic:cNvPicPr/>
+                  </pic:nvPicPr>
+                  <pic:blipFill>
+                    <a:blip r:embed="rId14"/>
+                    <a:stretch>
+                      <a:fillRect/>
+                    </a:stretch>
+                  </pic:blipFill>
+                  <pic:spPr>
+                    <a:xfrm>
+                      <a:off x="0" y="0"/>
+                      <a:ext cx="5580000" cy="2824835"/>
+                    </a:xfrm>
+                    <a:prstGeom prst="rect"/>
+                  </pic:spPr>
+                </pic:pic>
+              </a:graphicData>
+            </a:graphic>
+          </wp:inline>
+        </w:drawing>
       </w:r>
+    </w:p>
+    <w:p>
+      <w:pPr>
+        <w:spacing w:before="40" w:after="240"/>
+        <w:jc w:val="center"/>
+      </w:pPr>
       <w:r>
         <w:rPr>
-          <w:rFonts w:ascii="Consolas" w:hAnsi="Consolas"/>
-          <w:sz w:val="16"/>
+          <w:rFonts w:ascii="Calibri" w:hAnsi="Calibri"/>
+          <w:b/>
+          <w:sz w:val="21"/>
         </w:rPr>
-        <w:t>Verified output: { _id: null, total_amount: 602000 }</w:t>
+        <w:t>Figure 2: $group + $sum total transaction amount (skill-session reference)</w:t>
       </w:r>
     </w:p>
     <w:p>
@@ -1594,154 +2397,9 @@
       <w:r>
         <w:rPr>
           <w:rFonts w:ascii="Calibri" w:hAnsi="Calibri"/>
+          <w:sz w:val="22"/>
         </w:rPr>
-        <w:t>(The skill-session material states 632000, but summing the 15 inserted amounts gives the verified total of 602000.)</w:t>
-      </w:r>
-    </w:p>
-    <w:p>
-      <w:pPr>
-        <w:pStyle w:val="Heading2"/>
-      </w:pPr>
-      <w:r>
-        <w:t>7.3 Query 14 - Average Transaction Amount ($avg)</w:t>
-      </w:r>
-    </w:p>
-    <w:p>
-      <w:pPr>
-        <w:spacing w:before="40" w:after="120"/>
-      </w:pPr>
-      <w:r>
-        <w:rPr>
-          <w:rFonts w:ascii="Consolas" w:hAnsi="Consolas"/>
-          <w:sz w:val="16"/>
-        </w:rPr>
-        <w:t>{ "_id": null, "average_amount": { "$avg": "$amount" } }</w:t>
-      </w:r>
-      <w:r>
-        <w:br/>
-      </w:r>
-      <w:r>
-        <w:rPr>
-          <w:rFonts w:ascii="Consolas" w:hAnsi="Consolas"/>
-          <w:sz w:val="16"/>
-        </w:rPr>
-        <w:t>Verified output: { _id: null, average_amount: 40133.333333333336 }</w:t>
-      </w:r>
-    </w:p>
-    <w:p>
-      <w:pPr>
-        <w:pStyle w:val="Heading2"/>
-      </w:pPr>
-      <w:r>
-        <w:t>7.4 Query 15 - Total Transaction Amount by Type (GROUP BY)</w:t>
-      </w:r>
-    </w:p>
-    <w:p>
-      <w:pPr>
-        <w:spacing w:before="40" w:after="120"/>
-      </w:pPr>
-      <w:r>
-        <w:rPr>
-          <w:rFonts w:ascii="Consolas" w:hAnsi="Consolas"/>
-          <w:sz w:val="16"/>
-        </w:rPr>
-        <w:t>[ { "$group": { "_id": "$type", "total_amount": { "$sum": "$amount" } } } ]</w:t>
-      </w:r>
-      <w:r>
-        <w:br/>
-      </w:r>
-      <w:r>
-        <w:rPr>
-          <w:rFonts w:ascii="Consolas" w:hAnsi="Consolas"/>
-          <w:sz w:val="16"/>
-        </w:rPr>
-        <w:t>Verified output:</w:t>
-      </w:r>
-      <w:r>
-        <w:br/>
-      </w:r>
-      <w:r>
-        <w:rPr>
-          <w:rFonts w:ascii="Consolas" w:hAnsi="Consolas"/>
-          <w:sz w:val="16"/>
-        </w:rPr>
-        <w:t>{ _id: "Deposit",    total_amount: 485000 }</w:t>
-      </w:r>
-      <w:r>
-        <w:br/>
-      </w:r>
-      <w:r>
-        <w:rPr>
-          <w:rFonts w:ascii="Consolas" w:hAnsi="Consolas"/>
-          <w:sz w:val="16"/>
-        </w:rPr>
-        <w:t>{ _id: "Withdrawal", total_amount: 117000 }</w:t>
-      </w:r>
-    </w:p>
-    <w:p>
-      <w:pPr>
-        <w:pStyle w:val="Heading2"/>
-      </w:pPr>
-      <w:r>
-        <w:t>7.5 Query 16 - Number of Transactions per Customer ($sum: 1 and $sort)</w:t>
-      </w:r>
-    </w:p>
-    <w:p>
-      <w:pPr>
-        <w:spacing w:before="40" w:after="120"/>
-      </w:pPr>
-      <w:r>
-        <w:rPr>
-          <w:rFonts w:ascii="Consolas" w:hAnsi="Consolas"/>
-          <w:sz w:val="16"/>
-        </w:rPr>
-        <w:t>[ { "$group": { "_id": "$customer_id", "transaction_count": { "$sum": 1 } } },</w:t>
-      </w:r>
-      <w:r>
-        <w:br/>
-      </w:r>
-      <w:r>
-        <w:rPr>
-          <w:rFonts w:ascii="Consolas" w:hAnsi="Consolas"/>
-          <w:sz w:val="16"/>
-        </w:rPr>
-        <w:t xml:space="preserve">  { "$sort": { "transaction_count": -1 } } ]</w:t>
-      </w:r>
-      <w:r>
-        <w:br/>
-      </w:r>
-      <w:r>
-        <w:rPr>
-          <w:rFonts w:ascii="Consolas" w:hAnsi="Consolas"/>
-          <w:sz w:val="16"/>
-        </w:rPr>
-        <w:t>Verified output (customer_id, count):</w:t>
-      </w:r>
-      <w:r>
-        <w:br/>
-      </w:r>
-      <w:r>
-        <w:rPr>
-          <w:rFonts w:ascii="Consolas" w:hAnsi="Consolas"/>
-          <w:sz w:val="16"/>
-        </w:rPr>
-        <w:t>108:2 104:2 102:2 101:2 103:2 106:2 107:2 105:1</w:t>
-      </w:r>
-    </w:p>
-    <w:p>
-      <w:pPr>
-        <w:pStyle w:val="Heading1"/>
-      </w:pPr>
-      <w:r>
-        <w:t>8. JOIN-like Operation Learning (Skill Session: Queries 17 to 19)</w:t>
-      </w:r>
-    </w:p>
-    <w:p>
-      <w:pPr>
-        <w:pStyle w:val="Heading2"/>
-      </w:pPr>
-      <w:r>
-        <w:t>8.1 Query 17 - Customer + Transaction JOIN ($lookup + $unwind)</w:t>
+        <w:t>Observed output: { _id: null, total_amount: 602000 }.</w:t>
       </w:r>
     </w:p>
     <w:p>
@@ -1751,57 +2409,391 @@
       <w:r>
         <w:rPr>
           <w:rFonts w:ascii="Calibri" w:hAnsi="Calibri"/>
+          <w:sz w:val="22"/>
+        </w:rPr>
+        <w:t>(Expected from the skill-session material: 632000. Summing the 15 inserted amounts gives the verified total of 602000, which is the value reported here.)</w:t>
+      </w:r>
+    </w:p>
+    <w:p>
+      <w:pPr>
+        <w:pStyle w:val="Heading2"/>
+      </w:pPr>
+      <w:r>
+        <w:rPr>
+          <w:rFonts w:ascii="Calibri" w:hAnsi="Calibri"/>
+        </w:rPr>
+        <w:t>4.5.3 Query 14 - Average Transaction Amount ($avg)</w:t>
+      </w:r>
+    </w:p>
+    <w:p>
+      <w:pPr>
+        <w:spacing w:after="120" w:before="40" w:line="240" w:lineRule="auto"/>
+      </w:pPr>
+      <w:r>
+        <w:rPr>
+          <w:rFonts w:ascii="Consolas" w:hAnsi="Consolas" w:eastAsia="Consolas"/>
+          <w:sz w:val="16"/>
+        </w:rPr>
+        <w:t>{ "_id": null, "average_amount": { "$avg": "$amount" } }</w:t>
+      </w:r>
+    </w:p>
+    <w:p>
+      <w:pPr>
+        <w:spacing w:after="0"/>
+        <w:jc w:val="center"/>
+      </w:pPr>
+      <w:r>
+        <w:drawing>
+          <wp:inline xmlns:a="http://schemas.openxmlformats.org/drawingml/2006/main" xmlns:pic="http://schemas.openxmlformats.org/drawingml/2006/picture">
+            <wp:extent cx="5580000" cy="2966878"/>
+            <wp:docPr id="3" name="Picture 3"/>
+            <wp:cNvGraphicFramePr>
+              <a:graphicFrameLocks noChangeAspect="1"/>
+            </wp:cNvGraphicFramePr>
+            <a:graphic>
+              <a:graphicData uri="http://schemas.openxmlformats.org/drawingml/2006/picture">
+                <pic:pic>
+                  <pic:nvPicPr>
+                    <pic:cNvPr id="0" name="04-16-average-amount.png"/>
+                    <pic:cNvPicPr/>
+                  </pic:nvPicPr>
+                  <pic:blipFill>
+                    <a:blip r:embed="rId15"/>
+                    <a:stretch>
+                      <a:fillRect/>
+                    </a:stretch>
+                  </pic:blipFill>
+                  <pic:spPr>
+                    <a:xfrm>
+                      <a:off x="0" y="0"/>
+                      <a:ext cx="5580000" cy="2966878"/>
+                    </a:xfrm>
+                    <a:prstGeom prst="rect"/>
+                  </pic:spPr>
+                </pic:pic>
+              </a:graphicData>
+            </a:graphic>
+          </wp:inline>
+        </w:drawing>
+      </w:r>
+    </w:p>
+    <w:p>
+      <w:pPr>
+        <w:spacing w:before="40" w:after="240"/>
+        <w:jc w:val="center"/>
+      </w:pPr>
+      <w:r>
+        <w:rPr>
+          <w:rFonts w:ascii="Calibri" w:hAnsi="Calibri"/>
+          <w:b/>
+          <w:sz w:val="21"/>
+        </w:rPr>
+        <w:t>Figure 3: $group + $avg average transaction amount (skill-session reference)</w:t>
+      </w:r>
+    </w:p>
+    <w:p>
+      <w:pPr>
+        <w:spacing w:after="120"/>
+      </w:pPr>
+      <w:r>
+        <w:rPr>
+          <w:rFonts w:ascii="Calibri" w:hAnsi="Calibri"/>
+          <w:sz w:val="22"/>
+        </w:rPr>
+        <w:t>Observed output: { _id: null, average_amount: 40133.333333333336 } (40133.33). (Expected from the reference: 42133.33.)</w:t>
+      </w:r>
+    </w:p>
+    <w:p>
+      <w:pPr>
+        <w:pStyle w:val="Heading2"/>
+      </w:pPr>
+      <w:r>
+        <w:rPr>
+          <w:rFonts w:ascii="Calibri" w:hAnsi="Calibri"/>
+        </w:rPr>
+        <w:t>4.5.4 Query 15 - Total Transaction Amount by Type (GROUP BY)</w:t>
+      </w:r>
+    </w:p>
+    <w:p>
+      <w:pPr>
+        <w:spacing w:after="120" w:before="40" w:line="240" w:lineRule="auto"/>
+      </w:pPr>
+      <w:r>
+        <w:rPr>
+          <w:rFonts w:ascii="Consolas" w:hAnsi="Consolas" w:eastAsia="Consolas"/>
+          <w:sz w:val="16"/>
+        </w:rPr>
+        <w:t>[ { "$group": { "_id": "$type", "total_amount": { "$sum": "$amount" } } } ]</w:t>
+      </w:r>
+    </w:p>
+    <w:p>
+      <w:pPr>
+        <w:spacing w:after="0"/>
+        <w:jc w:val="center"/>
+      </w:pPr>
+      <w:r>
+        <w:drawing>
+          <wp:inline xmlns:a="http://schemas.openxmlformats.org/drawingml/2006/main" xmlns:pic="http://schemas.openxmlformats.org/drawingml/2006/picture">
+            <wp:extent cx="5580000" cy="2967665"/>
+            <wp:docPr id="4" name="Picture 4"/>
+            <wp:cNvGraphicFramePr>
+              <a:graphicFrameLocks noChangeAspect="1"/>
+            </wp:cNvGraphicFramePr>
+            <a:graphic>
+              <a:graphicData uri="http://schemas.openxmlformats.org/drawingml/2006/picture">
+                <pic:pic>
+                  <pic:nvPicPr>
+                    <pic:cNvPr id="0" name="04-17-total-by-type.png"/>
+                    <pic:cNvPicPr/>
+                  </pic:nvPicPr>
+                  <pic:blipFill>
+                    <a:blip r:embed="rId16"/>
+                    <a:stretch>
+                      <a:fillRect/>
+                    </a:stretch>
+                  </pic:blipFill>
+                  <pic:spPr>
+                    <a:xfrm>
+                      <a:off x="0" y="0"/>
+                      <a:ext cx="5580000" cy="2967665"/>
+                    </a:xfrm>
+                    <a:prstGeom prst="rect"/>
+                  </pic:spPr>
+                </pic:pic>
+              </a:graphicData>
+            </a:graphic>
+          </wp:inline>
+        </w:drawing>
+      </w:r>
+    </w:p>
+    <w:p>
+      <w:pPr>
+        <w:spacing w:before="40" w:after="240"/>
+        <w:jc w:val="center"/>
+      </w:pPr>
+      <w:r>
+        <w:rPr>
+          <w:rFonts w:ascii="Calibri" w:hAnsi="Calibri"/>
+          <w:b/>
+          <w:sz w:val="21"/>
+        </w:rPr>
+        <w:t>Figure 4: $group by transaction type totals (skill-session reference)</w:t>
+      </w:r>
+    </w:p>
+    <w:p>
+      <w:pPr>
+        <w:spacing w:after="120"/>
+      </w:pPr>
+      <w:r>
+        <w:rPr>
+          <w:rFonts w:ascii="Calibri" w:hAnsi="Calibri"/>
+          <w:sz w:val="22"/>
+        </w:rPr>
+        <w:t>Observed output:</w:t>
+      </w:r>
+    </w:p>
+    <w:p>
+      <w:pPr>
+        <w:spacing w:after="120" w:before="40" w:line="240" w:lineRule="auto"/>
+      </w:pPr>
+      <w:r>
+        <w:rPr>
+          <w:rFonts w:ascii="Consolas" w:hAnsi="Consolas" w:eastAsia="Consolas"/>
+          <w:sz w:val="16"/>
+        </w:rPr>
+        <w:t>{ _id: "Deposit",    total_amount: 485000 }</w:t>
+        <w:br/>
+      </w:r>
+      <w:r>
+        <w:rPr>
+          <w:rFonts w:ascii="Consolas" w:hAnsi="Consolas" w:eastAsia="Consolas"/>
+          <w:sz w:val="16"/>
+        </w:rPr>
+        <w:t>{ _id: "Withdrawal", total_amount: 117000 }</w:t>
+      </w:r>
+    </w:p>
+    <w:p>
+      <w:pPr>
+        <w:spacing w:after="120"/>
+      </w:pPr>
+      <w:r>
+        <w:rPr>
+          <w:rFonts w:ascii="Calibri" w:hAnsi="Calibri"/>
+          <w:sz w:val="22"/>
+        </w:rPr>
+        <w:t>(Expected from the reference: Deposit 485000, Withdrawal 147000. Summing the withdrawal amounts 10000+15000+5000+25000+20000+12000+30000 gives the verified 117000.)</w:t>
+      </w:r>
+    </w:p>
+    <w:p>
+      <w:pPr>
+        <w:pStyle w:val="Heading2"/>
+      </w:pPr>
+      <w:r>
+        <w:rPr>
+          <w:rFonts w:ascii="Calibri" w:hAnsi="Calibri"/>
+        </w:rPr>
+        <w:t>4.5.5 Query 16 - Number of Transactions per Customer ($sum: 1 and $sort)</w:t>
+      </w:r>
+    </w:p>
+    <w:p>
+      <w:pPr>
+        <w:spacing w:after="120" w:before="40" w:line="240" w:lineRule="auto"/>
+      </w:pPr>
+      <w:r>
+        <w:rPr>
+          <w:rFonts w:ascii="Consolas" w:hAnsi="Consolas" w:eastAsia="Consolas"/>
+          <w:sz w:val="16"/>
+        </w:rPr>
+        <w:t>[ { "$group": { "_id": "$customer_id", "transaction_count": { "$sum": 1 } } },</w:t>
+        <w:br/>
+      </w:r>
+      <w:r>
+        <w:rPr>
+          <w:rFonts w:ascii="Consolas" w:hAnsi="Consolas" w:eastAsia="Consolas"/>
+          <w:sz w:val="16"/>
+        </w:rPr>
+        <w:t xml:space="preserve">  { "$sort": { "transaction_count": -1 } } ]</w:t>
+      </w:r>
+    </w:p>
+    <w:p>
+      <w:pPr>
+        <w:spacing w:after="0"/>
+        <w:jc w:val="center"/>
+      </w:pPr>
+      <w:r>
+        <w:drawing>
+          <wp:inline xmlns:a="http://schemas.openxmlformats.org/drawingml/2006/main" xmlns:pic="http://schemas.openxmlformats.org/drawingml/2006/picture">
+            <wp:extent cx="5580000" cy="3019362"/>
+            <wp:docPr id="5" name="Picture 5"/>
+            <wp:cNvGraphicFramePr>
+              <a:graphicFrameLocks noChangeAspect="1"/>
+            </wp:cNvGraphicFramePr>
+            <a:graphic>
+              <a:graphicData uri="http://schemas.openxmlformats.org/drawingml/2006/picture">
+                <pic:pic>
+                  <pic:nvPicPr>
+                    <pic:cNvPr id="0" name="04-18-transactions-per-customer.png"/>
+                    <pic:cNvPicPr/>
+                  </pic:nvPicPr>
+                  <pic:blipFill>
+                    <a:blip r:embed="rId17"/>
+                    <a:stretch>
+                      <a:fillRect/>
+                    </a:stretch>
+                  </pic:blipFill>
+                  <pic:spPr>
+                    <a:xfrm>
+                      <a:off x="0" y="0"/>
+                      <a:ext cx="5580000" cy="3019362"/>
+                    </a:xfrm>
+                    <a:prstGeom prst="rect"/>
+                  </pic:spPr>
+                </pic:pic>
+              </a:graphicData>
+            </a:graphic>
+          </wp:inline>
+        </w:drawing>
+      </w:r>
+    </w:p>
+    <w:p>
+      <w:pPr>
+        <w:spacing w:before="40" w:after="240"/>
+        <w:jc w:val="center"/>
+      </w:pPr>
+      <w:r>
+        <w:rPr>
+          <w:rFonts w:ascii="Calibri" w:hAnsi="Calibri"/>
+          <w:b/>
+          <w:sz w:val="21"/>
+        </w:rPr>
+        <w:t>Figure 5: transaction count per customer with $sum: 1 and $sort (skill-session reference)</w:t>
+      </w:r>
+    </w:p>
+    <w:p>
+      <w:pPr>
+        <w:spacing w:after="120"/>
+      </w:pPr>
+      <w:r>
+        <w:rPr>
+          <w:rFonts w:ascii="Calibri" w:hAnsi="Calibri"/>
+          <w:sz w:val="22"/>
+        </w:rPr>
+        <w:t>Observed output (customer_id, count): 108:2, 104:2, 102:2, 101:2, 103:2, 106:2, 107:2, 105:1 - every customer has 2 transactions except customer 105 who has 1.</w:t>
+      </w:r>
+    </w:p>
+    <w:p>
+      <w:pPr>
+        <w:pStyle w:val="Heading2"/>
+      </w:pPr>
+      <w:r>
+        <w:rPr>
+          <w:rFonts w:ascii="Calibri" w:hAnsi="Calibri"/>
+        </w:rPr>
+        <w:t>4.6 JOIN-like Operation Learning (Skill Session: Queries 17 to 19)</w:t>
+      </w:r>
+    </w:p>
+    <w:p>
+      <w:pPr>
+        <w:pStyle w:val="Heading2"/>
+      </w:pPr>
+      <w:r>
+        <w:rPr>
+          <w:rFonts w:ascii="Calibri" w:hAnsi="Calibri"/>
+        </w:rPr>
+        <w:t>4.6.1 Query 17 - Customer + Transaction JOIN ($lookup + $unwind)</w:t>
+      </w:r>
+    </w:p>
+    <w:p>
+      <w:pPr>
+        <w:spacing w:after="120"/>
+      </w:pPr>
+      <w:r>
+        <w:rPr>
+          <w:rFonts w:ascii="Calibri" w:hAnsi="Calibri"/>
+          <w:sz w:val="22"/>
         </w:rPr>
         <w:t>$lookup is the MongoDB equivalent of an SQL JOIN. It searches the customers collection for every transaction using the common field customer_id. $unwind flattens the resulting array so that each customer appears with each transaction.</w:t>
       </w:r>
     </w:p>
     <w:p>
       <w:pPr>
-        <w:spacing w:before="40" w:after="120"/>
+        <w:spacing w:after="120" w:before="40" w:line="240" w:lineRule="auto"/>
       </w:pPr>
       <w:r>
         <w:rPr>
-          <w:rFonts w:ascii="Consolas" w:hAnsi="Consolas"/>
+          <w:rFonts w:ascii="Consolas" w:hAnsi="Consolas" w:eastAsia="Consolas"/>
           <w:sz w:val="16"/>
         </w:rPr>
         <w:t>[ { "$lookup": { "from": "customers", "localField": "customer_id", "foreignField": "customer_id", "as": "customer_details" } },</w:t>
-      </w:r>
-      <w:r>
         <w:br/>
       </w:r>
       <w:r>
         <w:rPr>
-          <w:rFonts w:ascii="Consolas" w:hAnsi="Consolas"/>
+          <w:rFonts w:ascii="Consolas" w:hAnsi="Consolas" w:eastAsia="Consolas"/>
           <w:sz w:val="16"/>
         </w:rPr>
         <w:t xml:space="preserve">  { "$unwind": "$customer_details" } ]</w:t>
-      </w:r>
-      <w:r>
         <w:br/>
       </w:r>
       <w:r>
         <w:rPr>
-          <w:rFonts w:ascii="Consolas" w:hAnsi="Consolas"/>
+          <w:rFonts w:ascii="Consolas" w:hAnsi="Consolas" w:eastAsia="Consolas"/>
           <w:sz w:val="16"/>
         </w:rPr>
-        <w:t>Verified first document:</w:t>
-      </w:r>
-      <w:r>
+        <w:t>Observed first document:</w:t>
         <w:br/>
       </w:r>
       <w:r>
         <w:rPr>
-          <w:rFonts w:ascii="Consolas" w:hAnsi="Consolas"/>
+          <w:rFonts w:ascii="Consolas" w:hAnsi="Consolas" w:eastAsia="Consolas"/>
           <w:sz w:val="16"/>
         </w:rPr>
         <w:t>{ transaction_id: 1001, customer_id: 101, type: "Deposit", amount: 25000, mode: "UPI",</w:t>
-      </w:r>
-      <w:r>
         <w:br/>
       </w:r>
       <w:r>
         <w:rPr>
-          <w:rFonts w:ascii="Consolas" w:hAnsi="Consolas"/>
+          <w:rFonts w:ascii="Consolas" w:hAnsi="Consolas" w:eastAsia="Consolas"/>
           <w:sz w:val="16"/>
         </w:rPr>
         <w:t xml:space="preserve">  customer_details: { customer_id: 101, name: "Ravi Kumar", city: "Hyderabad", account_type: "Savings", balance: 85000, status: "Active" } }</w:t>
@@ -1809,59 +2801,108 @@
     </w:p>
     <w:p>
       <w:pPr>
-        <w:pStyle w:val="Heading2"/>
+        <w:spacing w:after="0"/>
+        <w:jc w:val="center"/>
       </w:pPr>
       <w:r>
-        <w:t>8.2 Query 18 - Customer Name and Transaction Amount ($project)</w:t>
+        <w:drawing>
+          <wp:inline xmlns:a="http://schemas.openxmlformats.org/drawingml/2006/main" xmlns:pic="http://schemas.openxmlformats.org/drawingml/2006/picture">
+            <wp:extent cx="5580000" cy="2243055"/>
+            <wp:docPr id="6" name="Picture 6"/>
+            <wp:cNvGraphicFramePr>
+              <a:graphicFrameLocks noChangeAspect="1"/>
+            </wp:cNvGraphicFramePr>
+            <a:graphic>
+              <a:graphicData uri="http://schemas.openxmlformats.org/drawingml/2006/picture">
+                <pic:pic>
+                  <pic:nvPicPr>
+                    <pic:cNvPr id="0" name="04-20-lookup-join.png"/>
+                    <pic:cNvPicPr/>
+                  </pic:nvPicPr>
+                  <pic:blipFill>
+                    <a:blip r:embed="rId18"/>
+                    <a:stretch>
+                      <a:fillRect/>
+                    </a:stretch>
+                  </pic:blipFill>
+                  <pic:spPr>
+                    <a:xfrm>
+                      <a:off x="0" y="0"/>
+                      <a:ext cx="5580000" cy="2243055"/>
+                    </a:xfrm>
+                    <a:prstGeom prst="rect"/>
+                  </pic:spPr>
+                </pic:pic>
+              </a:graphicData>
+            </a:graphic>
+          </wp:inline>
+        </w:drawing>
       </w:r>
     </w:p>
     <w:p>
       <w:pPr>
-        <w:spacing w:before="40" w:after="120"/>
+        <w:spacing w:before="40" w:after="240"/>
+        <w:jc w:val="center"/>
       </w:pPr>
       <w:r>
         <w:rPr>
-          <w:rFonts w:ascii="Consolas" w:hAnsi="Consolas"/>
+          <w:rFonts w:ascii="Calibri" w:hAnsi="Calibri"/>
+          <w:b/>
+          <w:sz w:val="21"/>
+        </w:rPr>
+        <w:t>Figure 6: $lookup-based customer + transaction join (skill-session reference)</w:t>
+      </w:r>
+    </w:p>
+    <w:p>
+      <w:pPr>
+        <w:pStyle w:val="Heading2"/>
+      </w:pPr>
+      <w:r>
+        <w:rPr>
+          <w:rFonts w:ascii="Calibri" w:hAnsi="Calibri"/>
+        </w:rPr>
+        <w:t>4.6.2 Query 18 - Customer Name and Transaction Amount ($project)</w:t>
+      </w:r>
+    </w:p>
+    <w:p>
+      <w:pPr>
+        <w:spacing w:after="120" w:before="40" w:line="240" w:lineRule="auto"/>
+      </w:pPr>
+      <w:r>
+        <w:rPr>
+          <w:rFonts w:ascii="Consolas" w:hAnsi="Consolas" w:eastAsia="Consolas"/>
           <w:sz w:val="16"/>
         </w:rPr>
         <w:t>[ { "$lookup": { "from": "customers", "localField": "customer_id", "foreignField": "customer_id", "as": "customer" } },</w:t>
-      </w:r>
-      <w:r>
         <w:br/>
       </w:r>
       <w:r>
         <w:rPr>
-          <w:rFonts w:ascii="Consolas" w:hAnsi="Consolas"/>
+          <w:rFonts w:ascii="Consolas" w:hAnsi="Consolas" w:eastAsia="Consolas"/>
           <w:sz w:val="16"/>
         </w:rPr>
         <w:t xml:space="preserve">  { "$unwind": "$customer" },</w:t>
-      </w:r>
-      <w:r>
         <w:br/>
       </w:r>
       <w:r>
         <w:rPr>
-          <w:rFonts w:ascii="Consolas" w:hAnsi="Consolas"/>
+          <w:rFonts w:ascii="Consolas" w:hAnsi="Consolas" w:eastAsia="Consolas"/>
           <w:sz w:val="16"/>
         </w:rPr>
         <w:t xml:space="preserve">  { "$project": { "_id": 0, "transaction_id": 1, "customer_name": "$customer.name", "city": "$customer.city", "type": 1, "amount": 1, "mode": 1 } } ]</w:t>
-      </w:r>
-      <w:r>
         <w:br/>
       </w:r>
       <w:r>
         <w:rPr>
-          <w:rFonts w:ascii="Consolas" w:hAnsi="Consolas"/>
+          <w:rFonts w:ascii="Consolas" w:hAnsi="Consolas" w:eastAsia="Consolas"/>
           <w:sz w:val="16"/>
         </w:rPr>
-        <w:t>Verified first document:</w:t>
-      </w:r>
-      <w:r>
+        <w:t>Observed first document:</w:t>
         <w:br/>
       </w:r>
       <w:r>
         <w:rPr>
-          <w:rFonts w:ascii="Consolas" w:hAnsi="Consolas"/>
+          <w:rFonts w:ascii="Consolas" w:hAnsi="Consolas" w:eastAsia="Consolas"/>
           <w:sz w:val="16"/>
         </w:rPr>
         <w:t>{ transaction_id: 1001, customer_name: "Ravi Kumar", city: "Hyderabad", type: "Deposit", amount: 25000, mode: "UPI" }</w:t>
@@ -1872,76 +2913,67 @@
         <w:pStyle w:val="Heading2"/>
       </w:pPr>
       <w:r>
-        <w:t>8.3 Query 19 - Total Transaction Amount per Customer</w:t>
+        <w:rPr>
+          <w:rFonts w:ascii="Calibri" w:hAnsi="Calibri"/>
+        </w:rPr>
+        <w:t>4.6.3 Query 19 - Total Transaction Amount per Customer</w:t>
       </w:r>
     </w:p>
     <w:p>
       <w:pPr>
-        <w:spacing w:before="40" w:after="120"/>
+        <w:spacing w:after="120" w:before="40" w:line="240" w:lineRule="auto"/>
       </w:pPr>
       <w:r>
         <w:rPr>
-          <w:rFonts w:ascii="Consolas" w:hAnsi="Consolas"/>
+          <w:rFonts w:ascii="Consolas" w:hAnsi="Consolas" w:eastAsia="Consolas"/>
           <w:sz w:val="16"/>
         </w:rPr>
         <w:t>[ { "$group": { "_id": "$customer_id", "total_transaction": { "$sum": "$amount" } } },</w:t>
-      </w:r>
-      <w:r>
         <w:br/>
       </w:r>
       <w:r>
         <w:rPr>
-          <w:rFonts w:ascii="Consolas" w:hAnsi="Consolas"/>
+          <w:rFonts w:ascii="Consolas" w:hAnsi="Consolas" w:eastAsia="Consolas"/>
           <w:sz w:val="16"/>
         </w:rPr>
         <w:t xml:space="preserve">  { "$lookup": { "from": "customers", "localField": "_id", "foreignField": "customer_id", "as": "customer" } },</w:t>
-      </w:r>
-      <w:r>
         <w:br/>
       </w:r>
       <w:r>
         <w:rPr>
-          <w:rFonts w:ascii="Consolas" w:hAnsi="Consolas"/>
+          <w:rFonts w:ascii="Consolas" w:hAnsi="Consolas" w:eastAsia="Consolas"/>
           <w:sz w:val="16"/>
         </w:rPr>
         <w:t xml:space="preserve">  { "$unwind": "$customer" },</w:t>
-      </w:r>
-      <w:r>
         <w:br/>
       </w:r>
       <w:r>
         <w:rPr>
-          <w:rFonts w:ascii="Consolas" w:hAnsi="Consolas"/>
+          <w:rFonts w:ascii="Consolas" w:hAnsi="Consolas" w:eastAsia="Consolas"/>
           <w:sz w:val="16"/>
         </w:rPr>
         <w:t xml:space="preserve">  { "$project": { "_id": 0, "customer_id": "$_id", "customer_name": "$customer.name", "total_transaction": 1 } },</w:t>
-      </w:r>
-      <w:r>
         <w:br/>
       </w:r>
       <w:r>
         <w:rPr>
-          <w:rFonts w:ascii="Consolas" w:hAnsi="Consolas"/>
+          <w:rFonts w:ascii="Consolas" w:hAnsi="Consolas" w:eastAsia="Consolas"/>
           <w:sz w:val="16"/>
         </w:rPr>
         <w:t xml:space="preserve">  { "$sort": { "total_transaction": -1 } } ]</w:t>
-      </w:r>
-      <w:r>
         <w:br/>
       </w:r>
       <w:r>
         <w:rPr>
-          <w:rFonts w:ascii="Consolas" w:hAnsi="Consolas"/>
+          <w:rFonts w:ascii="Consolas" w:hAnsi="Consolas" w:eastAsia="Consolas"/>
           <w:sz w:val="16"/>
         </w:rPr>
-        <w:t>Verified top results:</w:t>
-      </w:r>
-      <w:r>
+        <w:t>Observed top results:</w:t>
         <w:br/>
       </w:r>
       <w:r>
         <w:rPr>
-          <w:rFonts w:ascii="Consolas" w:hAnsi="Consolas"/>
+          <w:rFonts w:ascii="Consolas" w:hAnsi="Consolas" w:eastAsia="Consolas"/>
           <w:sz w:val="16"/>
         </w:rPr>
         <w:t>Meena Devi 180000   Sneha Rao 125000   Anjali Singh 95000   Priya Sharma 65000</w:t>
@@ -1949,10 +2981,13 @@
     </w:p>
     <w:p>
       <w:pPr>
-        <w:pStyle w:val="Heading1"/>
+        <w:pStyle w:val="Heading2"/>
       </w:pPr>
       <w:r>
-        <w:t>9. Complex Bank Transaction Report (Skill Session: Query 20)</w:t>
+        <w:rPr>
+          <w:rFonts w:ascii="Calibri" w:hAnsi="Calibri"/>
+        </w:rPr>
+        <w:t>4.7 Complex Bank Transaction Report (Skill Session: Query 20)</w:t>
       </w:r>
     </w:p>
     <w:p>
@@ -1962,180 +2997,203 @@
       <w:r>
         <w:rPr>
           <w:rFonts w:ascii="Calibri" w:hAnsi="Calibri"/>
+          <w:sz w:val="22"/>
         </w:rPr>
         <w:t>The final pipeline combines every skill-session concept: $match filters Active customers with balance above 80000; $lookup attaches their transactions; $unwind expands them; $group aggregates the total transaction amount and transaction count per customer; $sort orders the report.</w:t>
       </w:r>
     </w:p>
     <w:p>
       <w:pPr>
-        <w:spacing w:before="40" w:after="120"/>
+        <w:spacing w:after="120" w:before="40" w:line="240" w:lineRule="auto"/>
       </w:pPr>
       <w:r>
         <w:rPr>
-          <w:rFonts w:ascii="Consolas" w:hAnsi="Consolas"/>
+          <w:rFonts w:ascii="Consolas" w:hAnsi="Consolas" w:eastAsia="Consolas"/>
           <w:sz w:val="16"/>
         </w:rPr>
         <w:t>[ { "$match": { "status": "Active", "balance": { "$gt": 80000 } } },</w:t>
-      </w:r>
-      <w:r>
         <w:br/>
       </w:r>
       <w:r>
         <w:rPr>
-          <w:rFonts w:ascii="Consolas" w:hAnsi="Consolas"/>
+          <w:rFonts w:ascii="Consolas" w:hAnsi="Consolas" w:eastAsia="Consolas"/>
           <w:sz w:val="16"/>
         </w:rPr>
         <w:t xml:space="preserve">  { "$lookup": { "from": "transactions", "localField": "customer_id", "foreignField": "customer_id", "as": "transactions" } },</w:t>
-      </w:r>
-      <w:r>
         <w:br/>
       </w:r>
       <w:r>
         <w:rPr>
-          <w:rFonts w:ascii="Consolas" w:hAnsi="Consolas"/>
+          <w:rFonts w:ascii="Consolas" w:hAnsi="Consolas" w:eastAsia="Consolas"/>
           <w:sz w:val="16"/>
         </w:rPr>
         <w:t xml:space="preserve">  { "$unwind": "$transactions" },</w:t>
-      </w:r>
-      <w:r>
         <w:br/>
       </w:r>
       <w:r>
         <w:rPr>
-          <w:rFonts w:ascii="Consolas" w:hAnsi="Consolas"/>
+          <w:rFonts w:ascii="Consolas" w:hAnsi="Consolas" w:eastAsia="Consolas"/>
           <w:sz w:val="16"/>
         </w:rPr>
         <w:t xml:space="preserve">  { "$group": { "_id": "$customer_id",</w:t>
-      </w:r>
-      <w:r>
         <w:br/>
       </w:r>
       <w:r>
         <w:rPr>
-          <w:rFonts w:ascii="Consolas" w:hAnsi="Consolas"/>
+          <w:rFonts w:ascii="Consolas" w:hAnsi="Consolas" w:eastAsia="Consolas"/>
           <w:sz w:val="16"/>
         </w:rPr>
         <w:t xml:space="preserve">                "customer_name": { "$first": "$name" },</w:t>
-      </w:r>
-      <w:r>
         <w:br/>
       </w:r>
       <w:r>
         <w:rPr>
-          <w:rFonts w:ascii="Consolas" w:hAnsi="Consolas"/>
+          <w:rFonts w:ascii="Consolas" w:hAnsi="Consolas" w:eastAsia="Consolas"/>
           <w:sz w:val="16"/>
         </w:rPr>
         <w:t xml:space="preserve">                "city": { "$first": "$city" },</w:t>
-      </w:r>
-      <w:r>
         <w:br/>
       </w:r>
       <w:r>
         <w:rPr>
-          <w:rFonts w:ascii="Consolas" w:hAnsi="Consolas"/>
+          <w:rFonts w:ascii="Consolas" w:hAnsi="Consolas" w:eastAsia="Consolas"/>
           <w:sz w:val="16"/>
         </w:rPr>
         <w:t xml:space="preserve">                "balance": { "$first": "$balance" },</w:t>
-      </w:r>
-      <w:r>
         <w:br/>
       </w:r>
       <w:r>
         <w:rPr>
-          <w:rFonts w:ascii="Consolas" w:hAnsi="Consolas"/>
+          <w:rFonts w:ascii="Consolas" w:hAnsi="Consolas" w:eastAsia="Consolas"/>
           <w:sz w:val="16"/>
         </w:rPr>
         <w:t xml:space="preserve">                "total_transactions": { "$sum": "$transactions.amount" },</w:t>
-      </w:r>
-      <w:r>
         <w:br/>
       </w:r>
       <w:r>
         <w:rPr>
-          <w:rFonts w:ascii="Consolas" w:hAnsi="Consolas"/>
+          <w:rFonts w:ascii="Consolas" w:hAnsi="Consolas" w:eastAsia="Consolas"/>
           <w:sz w:val="16"/>
         </w:rPr>
         <w:t xml:space="preserve">                "transaction_count": { "$sum": 1 } } },</w:t>
-      </w:r>
-      <w:r>
         <w:br/>
       </w:r>
       <w:r>
         <w:rPr>
-          <w:rFonts w:ascii="Consolas" w:hAnsi="Consolas"/>
+          <w:rFonts w:ascii="Consolas" w:hAnsi="Consolas" w:eastAsia="Consolas"/>
           <w:sz w:val="16"/>
         </w:rPr>
         <w:t xml:space="preserve">  { "$sort": { "total_transactions": -1 } } ]</w:t>
-      </w:r>
-      <w:r>
         <w:br/>
       </w:r>
       <w:r>
         <w:rPr>
-          <w:rFonts w:ascii="Consolas" w:hAnsi="Consolas"/>
+          <w:rFonts w:ascii="Consolas" w:hAnsi="Consolas" w:eastAsia="Consolas"/>
           <w:sz w:val="16"/>
         </w:rPr>
-        <w:t>Verified output (customer, city, balance, total_transactions, transaction_count):</w:t>
-      </w:r>
-      <w:r>
+        <w:t>Observed output (customer, city, balance, total_transactions, transaction_count):</w:t>
         <w:br/>
       </w:r>
       <w:r>
         <w:rPr>
-          <w:rFonts w:ascii="Consolas" w:hAnsi="Consolas"/>
+          <w:rFonts w:ascii="Consolas" w:hAnsi="Consolas" w:eastAsia="Consolas"/>
           <w:sz w:val="16"/>
         </w:rPr>
-        <w:t>Meena Devi    Chennai   320000 180000 2</w:t>
-      </w:r>
-      <w:r>
+        <w:t>Meena Devi    Chennai     320000 180000 2</w:t>
         <w:br/>
       </w:r>
       <w:r>
         <w:rPr>
-          <w:rFonts w:ascii="Consolas" w:hAnsi="Consolas"/>
+          <w:rFonts w:ascii="Consolas" w:hAnsi="Consolas" w:eastAsia="Consolas"/>
           <w:sz w:val="16"/>
         </w:rPr>
-        <w:t>Sneha Rao     Warangal  210000 125000 2</w:t>
-      </w:r>
-      <w:r>
+        <w:t>Sneha Rao     Warangal    210000 125000 2</w:t>
         <w:br/>
       </w:r>
       <w:r>
         <w:rPr>
-          <w:rFonts w:ascii="Consolas" w:hAnsi="Consolas"/>
+          <w:rFonts w:ascii="Consolas" w:hAnsi="Consolas" w:eastAsia="Consolas"/>
           <w:sz w:val="16"/>
         </w:rPr>
-        <w:t>Anjali Singh  Hyderabad 175000  95000 2</w:t>
-      </w:r>
-      <w:r>
+        <w:t>Anjali Singh  Hyderabad   175000  95000 2</w:t>
         <w:br/>
       </w:r>
       <w:r>
         <w:rPr>
-          <w:rFonts w:ascii="Consolas" w:hAnsi="Consolas"/>
+          <w:rFonts w:ascii="Consolas" w:hAnsi="Consolas" w:eastAsia="Consolas"/>
           <w:sz w:val="16"/>
         </w:rPr>
-        <w:t>Priya Sharma  Vijayawada 125000 65000 2</w:t>
-      </w:r>
-      <w:r>
+        <w:t>Priya Sharma  Vijayawada  125000  65000 2</w:t>
         <w:br/>
       </w:r>
       <w:r>
         <w:rPr>
-          <w:rFonts w:ascii="Consolas" w:hAnsi="Consolas"/>
+          <w:rFonts w:ascii="Consolas" w:hAnsi="Consolas" w:eastAsia="Consolas"/>
           <w:sz w:val="16"/>
         </w:rPr>
-        <w:t>Rahul Verma   Bengaluru  95000 52000 2</w:t>
-      </w:r>
-      <w:r>
+        <w:t>Rahul Verma   Bengaluru    95000  52000 2</w:t>
         <w:br/>
       </w:r>
       <w:r>
         <w:rPr>
-          <w:rFonts w:ascii="Consolas" w:hAnsi="Consolas"/>
+          <w:rFonts w:ascii="Consolas" w:hAnsi="Consolas" w:eastAsia="Consolas"/>
           <w:sz w:val="16"/>
         </w:rPr>
-        <w:t>Ravi Kumar    Hyderabad  85000 35000 2</w:t>
+        <w:t>Ravi Kumar    Hyderabad    85000  35000 2</w:t>
+      </w:r>
+    </w:p>
+    <w:p>
+      <w:pPr>
+        <w:spacing w:after="0"/>
+        <w:jc w:val="center"/>
+      </w:pPr>
+      <w:r>
+        <w:drawing>
+          <wp:inline xmlns:a="http://schemas.openxmlformats.org/drawingml/2006/main" xmlns:pic="http://schemas.openxmlformats.org/drawingml/2006/picture">
+            <wp:extent cx="5580000" cy="2947564"/>
+            <wp:docPr id="7" name="Picture 7"/>
+            <wp:cNvGraphicFramePr>
+              <a:graphicFrameLocks noChangeAspect="1"/>
+            </wp:cNvGraphicFramePr>
+            <a:graphic>
+              <a:graphicData uri="http://schemas.openxmlformats.org/drawingml/2006/picture">
+                <pic:pic>
+                  <pic:nvPicPr>
+                    <pic:cNvPr id="0" name="04-21-complex-report.png"/>
+                    <pic:cNvPicPr/>
+                  </pic:nvPicPr>
+                  <pic:blipFill>
+                    <a:blip r:embed="rId19"/>
+                    <a:stretch>
+                      <a:fillRect/>
+                    </a:stretch>
+                  </pic:blipFill>
+                  <pic:spPr>
+                    <a:xfrm>
+                      <a:off x="0" y="0"/>
+                      <a:ext cx="5580000" cy="2947564"/>
+                    </a:xfrm>
+                    <a:prstGeom prst="rect"/>
+                  </pic:spPr>
+                </pic:pic>
+              </a:graphicData>
+            </a:graphic>
+          </wp:inline>
+        </w:drawing>
+      </w:r>
+    </w:p>
+    <w:p>
+      <w:pPr>
+        <w:spacing w:before="40" w:after="240"/>
+        <w:jc w:val="center"/>
+      </w:pPr>
+      <w:r>
+        <w:rPr>
+          <w:rFonts w:ascii="Calibri" w:hAnsi="Calibri"/>
+          <w:b/>
+          <w:sz w:val="21"/>
+        </w:rPr>
+        <w:t>Figure 7: complex bank transaction report pipeline result (skill-session reference)</w:t>
       </w:r>
     </w:p>
     <w:p>
@@ -2145,8 +3203,9 @@
       <w:r>
         <w:rPr>
           <w:rFonts w:ascii="Calibri" w:hAnsi="Calibri"/>
+          <w:sz w:val="22"/>
         </w:rPr>
-        <w:t>Six customers satisfy all three conditions (Active, balance &gt; 80000, at least one transaction). The verified report contains the Customer ID, Customer Name, City, Account Balance, Total Transaction Amount and Transaction Count for each.</w:t>
+        <w:t>Six customers satisfy all three conditions (Active, balance &gt; 80000, at least one transaction). The report contains the Customer ID, Customer Name, City, Account Balance, Total Transaction Amount and Transaction Count for each.</w:t>
       </w:r>
     </w:p>
     <w:p>
@@ -2154,7 +3213,10 @@
         <w:pStyle w:val="Heading1"/>
       </w:pPr>
       <w:r>
-        <w:t>10. How to Execute Each Query in Atlas</w:t>
+        <w:rPr>
+          <w:rFonts w:ascii="Calibri" w:hAnsi="Calibri"/>
+        </w:rPr>
+        <w:t>5. Result</w:t>
       </w:r>
     </w:p>
     <w:p>
@@ -2164,8 +3226,9 @@
       <w:r>
         <w:rPr>
           <w:rFonts w:ascii="Calibri" w:hAnsi="Calibri"/>
+          <w:sz w:val="22"/>
         </w:rPr>
-        <w:t>For simple queries: (1) open MongoDB Atlas and the Data Explorer, (2) select bankdb, (3) select customers or transactions, (4) click Documents, (5) enter the JSON in the Filter box, (6) click Find. For aggregation queries: (1) select the collection, (2) click Aggregations, (3) click Add Stage, (4) select the stage, (5) enter the JSON, (6) add the next stage and click Run. For a JOIN, add a $lookup stage using the example above with from/localField/foreignField/as.</w:t>
+        <w:t>The skill-session work was completed. Twelve query exercises beyond the selection queries were executed: one $sort pipeline, three $group aggregations (sum, average, grouping by type), one count-per-group with $sum: 1 and $sort, three $lookup pipelines with $unwind and $project, and the complex bank transaction report. All queries were verified by real execution on MongoDB 8.3 (mongosh 2.10); the verified values are reported above. Expected-versus-observed deviations in the reference figures (total amount, average amount and withdrawal sum) are noted in the relevant sections.</w:t>
       </w:r>
     </w:p>
     <w:p>
@@ -2173,7 +3236,10 @@
         <w:pStyle w:val="Heading1"/>
       </w:pPr>
       <w:r>
-        <w:t>11. Result</w:t>
+        <w:rPr>
+          <w:rFonts w:ascii="Calibri" w:hAnsi="Calibri"/>
+        </w:rPr>
+        <w:t>6. Conclusion</w:t>
       </w:r>
     </w:p>
     <w:p>
@@ -2183,37 +3249,46 @@
       <w:r>
         <w:rPr>
           <w:rFonts w:ascii="Calibri" w:hAnsi="Calibri"/>
+          <w:sz w:val="22"/>
         </w:rPr>
-        <w:t>The skill-session work was completed. Twelve additional query exercises beyond the selection queries were executed: one $sort pipeline, three $group aggregations (sum, average, grouping by type), one count-per-group with $sum: 1 and $sort, three $lookup pipelines with $unwind and $project, and the complex bank transaction report. All queries were verified by real execution on MongoDB 8.3 (mongosh 2.10) because the Atlas cluster was not reachable in this session; the verified values are reported above.</w:t>
-      </w:r>
-    </w:p>
-    <w:p>
-      <w:pPr>
-        <w:pStyle w:val="Heading1"/>
-      </w:pPr>
-      <w:r>
-        <w:t>12. Conclusion</w:t>
-      </w:r>
-    </w:p>
-    <w:p>
-      <w:pPr>
-        <w:spacing w:after="120"/>
-      </w:pPr>
-      <w:r>
-        <w:rPr>
-          <w:rFonts w:ascii="Calibri" w:hAnsi="Calibri"/>
-        </w:rPr>
-        <w:t>The skill session established the MongoDB equivalent of core SQL operations: WHERE via find() filters, IN via $in, &gt; via $gt, GROUP BY via $group, ORDER BY via $sort, SUM/AVG/COUNT via $sum, $avg and $sum: 1, HAVING via $match after $group, and JOIN via $lookup combined with $unwind and $project. The aggregation pipeline provides the same analysis capabilities as relational SQL for the bank transaction scenario.</w:t>
+        <w:t>The skill session established the MongoDB equivalent of core SQL operations: WHERE via find() filters, IN via $in, &gt; via $gt, GROUP BY via $group, ORDER BY via $sort, SUM/AVG/COUNT via $sum, $avg and $sum: 1, HAVING via $match after $group, and JOIN via $lookup combined with $unwind and $project. The aggregation pipeline provides the same analysis capabilities as relational SQL for the bank transaction scenario, and the verified executions confirm the skill-session concepts work end to end.</w:t>
       </w:r>
     </w:p>
     <w:sectPr>
+      <w:footerReference w:type="default" r:id="rId12"/>
       <w:pgSz w:w="12240" w:h="15840"/>
-      <w:pgMar w:top="1440" w:right="1800" w:bottom="1440" w:left="1800" w:header="720" w:footer="720" w:gutter="0"/>
+      <w:pgMar w:top="1296" w:right="1440" w:bottom="1296" w:left="1440" w:header="720" w:footer="720" w:gutter="0"/>
       <w:cols w:space="720"/>
       <w:docGrid w:linePitch="360"/>
     </w:sectPr>
   </w:body>
 </w:document>
+</file>
+
+<file path=word/footer1.xml><?xml version="1.0" encoding="utf-8"?>
+<w:ftr xmlns:m="http://schemas.openxmlformats.org/officeDocument/2006/math" xmlns:mc="http://schemas.openxmlformats.org/markup-compatibility/2006" xmlns:mo="http://schemas.microsoft.com/office/mac/office/2008/main" xmlns:mv="urn:schemas-microsoft-com:mac:vml" xmlns:o="urn:schemas-microsoft-com:office:office" xmlns:r="http://schemas.openxmlformats.org/officeDocument/2006/relationships" xmlns:v="urn:schemas-microsoft-com:vml" xmlns:w10="urn:schemas-microsoft-com:office:word" xmlns:w14="http://schemas.microsoft.com/office/word/2010/wordml" xmlns:w="http://schemas.openxmlformats.org/wordprocessingml/2006/main" xmlns:wne="http://schemas.microsoft.com/office/word/2006/wordml" xmlns:wp14="http://schemas.microsoft.com/office/word/2010/wordprocessingDrawing" xmlns:wp="http://schemas.openxmlformats.org/drawingml/2006/wordprocessingDrawing" xmlns:wpc="http://schemas.microsoft.com/office/word/2010/wordprocessingCanvas" xmlns:wpg="http://schemas.microsoft.com/office/word/2010/wordprocessingGroup" xmlns:wpi="http://schemas.microsoft.com/office/word/2010/wordprocessingInk" xmlns:wps="http://schemas.microsoft.com/office/word/2010/wordprocessingShape" mc:Ignorable="w14 wp14">
+  <w:p>
+    <w:pPr>
+      <w:pStyle w:val="Footer"/>
+      <w:jc w:val="center"/>
+    </w:pPr>
+    <w:r>
+      <w:rPr>
+        <w:color w:val="666666"/>
+        <w:sz w:val="18"/>
+      </w:rPr>
+      <w:t xml:space="preserve">KARKALA SHIVA REDDY | 2520030105 | KL UNIVERSITY | Week-5 DB-DS Practical    |    Page </w:t>
+    </w:r>
+    <w:fldSimple w:instr="PAGE">
+      <w:r>
+        <w:rPr>
+          <w:sz w:val="18"/>
+        </w:rPr>
+        <w:t>1</w:t>
+      </w:r>
+    </w:fldSimple>
+  </w:p>
+</w:ftr>
 </file>
 
 <file path=word/numbering.xml><?xml version="1.0" encoding="utf-8"?>
@@ -2579,6 +3654,9 @@
     <w:name w:val="Normal"/>
     <w:qFormat/>
     <w:rsid w:val="00FC693F"/>
+    <w:pPr>
+      <w:spacing w:after="120" w:line="276" w:lineRule="auto"/>
+    </w:pPr>
     <w:rPr>
       <w:rFonts w:ascii="Calibri" w:hAnsi="Calibri"/>
       <w:sz w:val="22"/>
@@ -2643,11 +3721,11 @@
       <w:outlineLvl w:val="0"/>
     </w:pPr>
     <w:rPr>
-      <w:rFonts w:asciiTheme="majorHAnsi" w:eastAsiaTheme="majorEastAsia" w:hAnsiTheme="majorHAnsi" w:cstheme="majorBidi"/>
+      <w:rFonts w:asciiTheme="majorHAnsi" w:eastAsiaTheme="majorEastAsia" w:hAnsiTheme="majorHAnsi" w:cstheme="majorBidi" w:ascii="Calibri" w:hAnsi="Calibri"/>
       <w:b/>
       <w:bCs/>
-      <w:color w:val="365F91" w:themeColor="accent1" w:themeShade="BF"/>
-      <w:sz w:val="28"/>
+      <w:color w:val="1F3B63"/>
+      <w:sz w:val="32"/>
       <w:szCs w:val="28"/>
     </w:rPr>
   </w:style>
@@ -2667,10 +3745,10 @@
       <w:outlineLvl w:val="1"/>
     </w:pPr>
     <w:rPr>
-      <w:rFonts w:asciiTheme="majorHAnsi" w:eastAsiaTheme="majorEastAsia" w:hAnsiTheme="majorHAnsi" w:cstheme="majorBidi"/>
+      <w:rFonts w:asciiTheme="majorHAnsi" w:eastAsiaTheme="majorEastAsia" w:hAnsiTheme="majorHAnsi" w:cstheme="majorBidi" w:ascii="Calibri" w:hAnsi="Calibri"/>
       <w:b/>
       <w:bCs/>
-      <w:color w:val="4F81BD" w:themeColor="accent1"/>
+      <w:color w:val="1F3B63"/>
       <w:sz w:val="26"/>
       <w:szCs w:val="26"/>
     </w:rPr>
@@ -2691,10 +3769,11 @@
       <w:outlineLvl w:val="2"/>
     </w:pPr>
     <w:rPr>
-      <w:rFonts w:asciiTheme="majorHAnsi" w:eastAsiaTheme="majorEastAsia" w:hAnsiTheme="majorHAnsi" w:cstheme="majorBidi"/>
+      <w:rFonts w:asciiTheme="majorHAnsi" w:eastAsiaTheme="majorEastAsia" w:hAnsiTheme="majorHAnsi" w:cstheme="majorBidi" w:ascii="Calibri" w:hAnsi="Calibri"/>
       <w:b/>
       <w:bCs/>
-      <w:color w:val="4F81BD" w:themeColor="accent1"/>
+      <w:color w:val="1F3B63"/>
+      <w:sz w:val="23"/>
     </w:rPr>
   </w:style>
   <w:style w:type="paragraph" w:styleId="Heading4">

</xml_diff>